<commit_message>
Removed request logs from console in production env. Added updated project plan.
</commit_message>
<xml_diff>
--- a/Documentation/Project plan.docx
+++ b/Documentation/Project plan.docx
@@ -558,7 +558,7 @@
       <w:r>
         <w:fldChar w:fldCharType="separate"/>
       </w:r>
-      <w:hyperlink w:anchor="_Toc2096315382">
+      <w:hyperlink w:anchor="_Toc32094059">
         <w:r>
           <w:rPr>
             <w:rStyle w:val="Hyperlink"/>
@@ -581,7 +581,7 @@
           <w:fldChar w:fldCharType="begin"/>
         </w:r>
         <w:r>
-          <w:instrText xml:space="preserve">PAGEREF _Toc2096315382 \h</w:instrText>
+          <w:instrText xml:space="preserve">PAGEREF _Toc32094059 \h</w:instrText>
         </w:r>
         <w:r>
           <w:fldChar w:fldCharType="separate"/>
@@ -615,7 +615,7 @@
           <w14:ligatures w14:val="standardContextual"/>
         </w:rPr>
       </w:pPr>
-      <w:hyperlink w:anchor="_Toc432247473">
+      <w:hyperlink w:anchor="_Toc1288870773">
         <w:r>
           <w:rPr>
             <w:rStyle w:val="Hyperlink"/>
@@ -638,7 +638,7 @@
           <w:fldChar w:fldCharType="begin"/>
         </w:r>
         <w:r>
-          <w:instrText xml:space="preserve">PAGEREF _Toc432247473 \h</w:instrText>
+          <w:instrText xml:space="preserve">PAGEREF _Toc1288870773 \h</w:instrText>
         </w:r>
         <w:r>
           <w:fldChar w:fldCharType="separate"/>
@@ -671,7 +671,7 @@
           <w14:ligatures w14:val="standardContextual"/>
         </w:rPr>
       </w:pPr>
-      <w:hyperlink w:anchor="_Toc641023352">
+      <w:hyperlink w:anchor="_Toc917729410">
         <w:r>
           <w:rPr>
             <w:rStyle w:val="Hyperlink"/>
@@ -694,7 +694,7 @@
           <w:fldChar w:fldCharType="begin"/>
         </w:r>
         <w:r>
-          <w:instrText xml:space="preserve">PAGEREF _Toc641023352 \h</w:instrText>
+          <w:instrText xml:space="preserve">PAGEREF _Toc917729410 \h</w:instrText>
         </w:r>
         <w:r>
           <w:fldChar w:fldCharType="separate"/>
@@ -727,7 +727,7 @@
           <w14:ligatures w14:val="standardContextual"/>
         </w:rPr>
       </w:pPr>
-      <w:hyperlink w:anchor="_Toc1673774202">
+      <w:hyperlink w:anchor="_Toc1600587042">
         <w:r>
           <w:rPr>
             <w:rStyle w:val="Hyperlink"/>
@@ -750,7 +750,7 @@
           <w:fldChar w:fldCharType="begin"/>
         </w:r>
         <w:r>
-          <w:instrText xml:space="preserve">PAGEREF _Toc1673774202 \h</w:instrText>
+          <w:instrText xml:space="preserve">PAGEREF _Toc1600587042 \h</w:instrText>
         </w:r>
         <w:r>
           <w:fldChar w:fldCharType="separate"/>
@@ -784,7 +784,7 @@
           <w14:ligatures w14:val="standardContextual"/>
         </w:rPr>
       </w:pPr>
-      <w:hyperlink w:anchor="_Toc1455808958">
+      <w:hyperlink w:anchor="_Toc629860699">
         <w:r>
           <w:rPr>
             <w:rStyle w:val="Hyperlink"/>
@@ -807,7 +807,7 @@
           <w:fldChar w:fldCharType="begin"/>
         </w:r>
         <w:r>
-          <w:instrText xml:space="preserve">PAGEREF _Toc1455808958 \h</w:instrText>
+          <w:instrText xml:space="preserve">PAGEREF _Toc629860699 \h</w:instrText>
         </w:r>
         <w:r>
           <w:fldChar w:fldCharType="separate"/>
@@ -840,7 +840,7 @@
           <w14:ligatures w14:val="standardContextual"/>
         </w:rPr>
       </w:pPr>
-      <w:hyperlink w:anchor="_Toc1056749410">
+      <w:hyperlink w:anchor="_Toc1684818426">
         <w:r>
           <w:rPr>
             <w:rStyle w:val="Hyperlink"/>
@@ -863,7 +863,7 @@
           <w:fldChar w:fldCharType="begin"/>
         </w:r>
         <w:r>
-          <w:instrText xml:space="preserve">PAGEREF _Toc1056749410 \h</w:instrText>
+          <w:instrText xml:space="preserve">PAGEREF _Toc1684818426 \h</w:instrText>
         </w:r>
         <w:r>
           <w:fldChar w:fldCharType="separate"/>
@@ -896,7 +896,7 @@
           <w14:ligatures w14:val="standardContextual"/>
         </w:rPr>
       </w:pPr>
-      <w:hyperlink w:anchor="_Toc1961304100">
+      <w:hyperlink w:anchor="_Toc2079402666">
         <w:r>
           <w:rPr>
             <w:rStyle w:val="Hyperlink"/>
@@ -919,7 +919,7 @@
           <w:fldChar w:fldCharType="begin"/>
         </w:r>
         <w:r>
-          <w:instrText xml:space="preserve">PAGEREF _Toc1961304100 \h</w:instrText>
+          <w:instrText xml:space="preserve">PAGEREF _Toc2079402666 \h</w:instrText>
         </w:r>
         <w:r>
           <w:fldChar w:fldCharType="separate"/>
@@ -952,7 +952,7 @@
           <w14:ligatures w14:val="standardContextual"/>
         </w:rPr>
       </w:pPr>
-      <w:hyperlink w:anchor="_Toc1534019633">
+      <w:hyperlink w:anchor="_Toc334642722">
         <w:r>
           <w:rPr>
             <w:rStyle w:val="Hyperlink"/>
@@ -975,7 +975,7 @@
           <w:fldChar w:fldCharType="begin"/>
         </w:r>
         <w:r>
-          <w:instrText xml:space="preserve">PAGEREF _Toc1534019633 \h</w:instrText>
+          <w:instrText xml:space="preserve">PAGEREF _Toc334642722 \h</w:instrText>
         </w:r>
         <w:r>
           <w:fldChar w:fldCharType="separate"/>
@@ -1008,7 +1008,7 @@
           <w14:ligatures w14:val="standardContextual"/>
         </w:rPr>
       </w:pPr>
-      <w:hyperlink w:anchor="_Toc1153723539">
+      <w:hyperlink w:anchor="_Toc1436348381">
         <w:r>
           <w:rPr>
             <w:rStyle w:val="Hyperlink"/>
@@ -1031,7 +1031,7 @@
           <w:fldChar w:fldCharType="begin"/>
         </w:r>
         <w:r>
-          <w:instrText xml:space="preserve">PAGEREF _Toc1153723539 \h</w:instrText>
+          <w:instrText xml:space="preserve">PAGEREF _Toc1436348381 \h</w:instrText>
         </w:r>
         <w:r>
           <w:fldChar w:fldCharType="separate"/>
@@ -1064,7 +1064,7 @@
           <w14:ligatures w14:val="standardContextual"/>
         </w:rPr>
       </w:pPr>
-      <w:hyperlink w:anchor="_Toc1326302207">
+      <w:hyperlink w:anchor="_Toc178799646">
         <w:r>
           <w:rPr>
             <w:rStyle w:val="Hyperlink"/>
@@ -1087,7 +1087,7 @@
           <w:fldChar w:fldCharType="begin"/>
         </w:r>
         <w:r>
-          <w:instrText xml:space="preserve">PAGEREF _Toc1326302207 \h</w:instrText>
+          <w:instrText xml:space="preserve">PAGEREF _Toc178799646 \h</w:instrText>
         </w:r>
         <w:r>
           <w:fldChar w:fldCharType="separate"/>
@@ -1120,7 +1120,7 @@
           <w14:ligatures w14:val="standardContextual"/>
         </w:rPr>
       </w:pPr>
-      <w:hyperlink w:anchor="_Toc1654132234">
+      <w:hyperlink w:anchor="_Toc1643055133">
         <w:r>
           <w:rPr>
             <w:rStyle w:val="Hyperlink"/>
@@ -1143,7 +1143,7 @@
           <w:fldChar w:fldCharType="begin"/>
         </w:r>
         <w:r>
-          <w:instrText xml:space="preserve">PAGEREF _Toc1654132234 \h</w:instrText>
+          <w:instrText xml:space="preserve">PAGEREF _Toc1643055133 \h</w:instrText>
         </w:r>
         <w:r>
           <w:fldChar w:fldCharType="separate"/>
@@ -1152,7 +1152,7 @@
           <w:rPr>
             <w:rStyle w:val="Hyperlink"/>
           </w:rPr>
-          <w:t>9</w:t>
+          <w:t>8</w:t>
         </w:r>
         <w:r>
           <w:fldChar w:fldCharType="end"/>
@@ -1176,7 +1176,7 @@
           <w14:ligatures w14:val="standardContextual"/>
         </w:rPr>
       </w:pPr>
-      <w:hyperlink w:anchor="_Toc1325118075">
+      <w:hyperlink w:anchor="_Toc1887849652">
         <w:r>
           <w:rPr>
             <w:rStyle w:val="Hyperlink"/>
@@ -1199,7 +1199,7 @@
           <w:fldChar w:fldCharType="begin"/>
         </w:r>
         <w:r>
-          <w:instrText xml:space="preserve">PAGEREF _Toc1325118075 \h</w:instrText>
+          <w:instrText xml:space="preserve">PAGEREF _Toc1887849652 \h</w:instrText>
         </w:r>
         <w:r>
           <w:fldChar w:fldCharType="separate"/>
@@ -1208,7 +1208,7 @@
           <w:rPr>
             <w:rStyle w:val="Hyperlink"/>
           </w:rPr>
-          <w:t>9</w:t>
+          <w:t>10</w:t>
         </w:r>
         <w:r>
           <w:fldChar w:fldCharType="end"/>
@@ -1232,7 +1232,7 @@
           <w14:ligatures w14:val="standardContextual"/>
         </w:rPr>
       </w:pPr>
-      <w:hyperlink w:anchor="_Toc1244249167">
+      <w:hyperlink w:anchor="_Toc1743919577">
         <w:r>
           <w:rPr>
             <w:rStyle w:val="Hyperlink"/>
@@ -1255,7 +1255,7 @@
           <w:fldChar w:fldCharType="begin"/>
         </w:r>
         <w:r>
-          <w:instrText xml:space="preserve">PAGEREF _Toc1244249167 \h</w:instrText>
+          <w:instrText xml:space="preserve">PAGEREF _Toc1743919577 \h</w:instrText>
         </w:r>
         <w:r>
           <w:fldChar w:fldCharType="separate"/>
@@ -1264,7 +1264,7 @@
           <w:rPr>
             <w:rStyle w:val="Hyperlink"/>
           </w:rPr>
-          <w:t>10</w:t>
+          <w:t>11</w:t>
         </w:r>
         <w:r>
           <w:fldChar w:fldCharType="end"/>
@@ -1288,7 +1288,7 @@
           <w14:ligatures w14:val="standardContextual"/>
         </w:rPr>
       </w:pPr>
-      <w:hyperlink w:anchor="_Toc1760740853">
+      <w:hyperlink w:anchor="_Toc1069343186">
         <w:r>
           <w:rPr>
             <w:rStyle w:val="Hyperlink"/>
@@ -1311,7 +1311,7 @@
           <w:fldChar w:fldCharType="begin"/>
         </w:r>
         <w:r>
-          <w:instrText xml:space="preserve">PAGEREF _Toc1760740853 \h</w:instrText>
+          <w:instrText xml:space="preserve">PAGEREF _Toc1069343186 \h</w:instrText>
         </w:r>
         <w:r>
           <w:fldChar w:fldCharType="separate"/>
@@ -1344,7 +1344,7 @@
           <w14:ligatures w14:val="standardContextual"/>
         </w:rPr>
       </w:pPr>
-      <w:hyperlink w:anchor="_Toc333273573">
+      <w:hyperlink w:anchor="_Toc1613483436">
         <w:r>
           <w:rPr>
             <w:rStyle w:val="Hyperlink"/>
@@ -1367,7 +1367,7 @@
           <w:fldChar w:fldCharType="begin"/>
         </w:r>
         <w:r>
-          <w:instrText xml:space="preserve">PAGEREF _Toc333273573 \h</w:instrText>
+          <w:instrText xml:space="preserve">PAGEREF _Toc1613483436 \h</w:instrText>
         </w:r>
         <w:r>
           <w:fldChar w:fldCharType="separate"/>
@@ -1376,7 +1376,7 @@
           <w:rPr>
             <w:rStyle w:val="Hyperlink"/>
           </w:rPr>
-          <w:t>11</w:t>
+          <w:t>12</w:t>
         </w:r>
         <w:r>
           <w:fldChar w:fldCharType="end"/>
@@ -1400,7 +1400,7 @@
           <w14:ligatures w14:val="standardContextual"/>
         </w:rPr>
       </w:pPr>
-      <w:hyperlink w:anchor="_Toc565982724">
+      <w:hyperlink w:anchor="_Toc604258318">
         <w:r>
           <w:rPr>
             <w:rStyle w:val="Hyperlink"/>
@@ -1423,7 +1423,7 @@
           <w:fldChar w:fldCharType="begin"/>
         </w:r>
         <w:r>
-          <w:instrText xml:space="preserve">PAGEREF _Toc565982724 \h</w:instrText>
+          <w:instrText xml:space="preserve">PAGEREF _Toc604258318 \h</w:instrText>
         </w:r>
         <w:r>
           <w:fldChar w:fldCharType="separate"/>
@@ -1432,7 +1432,7 @@
           <w:rPr>
             <w:rStyle w:val="Hyperlink"/>
           </w:rPr>
-          <w:t>11</w:t>
+          <w:t>12</w:t>
         </w:r>
         <w:r>
           <w:fldChar w:fldCharType="end"/>
@@ -1441,8 +1441,9 @@
     </w:p>
     <w:p>
       <w:pPr>
-        <w:pStyle w:val="TOC1"/>
+        <w:pStyle w:val="TOC3"/>
         <w:tabs>
+          <w:tab w:val="left" w:leader="none" w:pos="1200"/>
           <w:tab w:val="right" w:leader="dot" w:pos="9900"/>
         </w:tabs>
         <w:rPr>
@@ -1454,7 +1455,62 @@
           <w14:ligatures w14:val="standardContextual"/>
         </w:rPr>
       </w:pPr>
-      <w:hyperlink w:anchor="_Toc445770573">
+      <w:hyperlink w:anchor="_Toc170042382">
+        <w:r>
+          <w:rPr>
+            <w:rStyle w:val="Hyperlink"/>
+          </w:rPr>
+          <w:t>3.4.4</w:t>
+        </w:r>
+        <w:r>
+          <w:tab/>
+        </w:r>
+        <w:r>
+          <w:rPr>
+            <w:rStyle w:val="Hyperlink"/>
+          </w:rPr>
+          <w:t>Optional/future functionalities</w:t>
+        </w:r>
+        <w:r>
+          <w:tab/>
+        </w:r>
+        <w:r>
+          <w:fldChar w:fldCharType="begin"/>
+        </w:r>
+        <w:r>
+          <w:instrText xml:space="preserve">PAGEREF _Toc170042382 \h</w:instrText>
+        </w:r>
+        <w:r>
+          <w:fldChar w:fldCharType="separate"/>
+        </w:r>
+        <w:r>
+          <w:rPr>
+            <w:rStyle w:val="Hyperlink"/>
+          </w:rPr>
+          <w:t>12</w:t>
+        </w:r>
+        <w:r>
+          <w:fldChar w:fldCharType="end"/>
+        </w:r>
+      </w:hyperlink>
+    </w:p>
+    <w:p>
+      <w:pPr>
+        <w:pStyle w:val="TOC1"/>
+        <w:tabs>
+          <w:tab w:val="left" w:leader="none" w:pos="480"/>
+          <w:tab w:val="right" w:leader="dot" w:pos="9900"/>
+        </w:tabs>
+        <w:rPr>
+          <w:rFonts w:ascii="Calibri" w:hAnsi="Calibri" w:asciiTheme="minorAscii" w:hAnsiTheme="minorAscii"/>
+          <w:b w:val="0"/>
+          <w:bCs w:val="0"/>
+          <w:kern w:val="2"/>
+          <w:lang w:eastAsia="zh-CN"/>
+          <w14:ligatures w14:val="standardContextual"/>
+        </w:rPr>
+      </w:pPr>
+      <w:hyperlink w:anchor="_Toc1454625724">
         <w:r>
           <w:rPr>
             <w:rStyle w:val="Hyperlink"/>
@@ -1468,7 +1524,7 @@
           <w:rPr>
             <w:rStyle w:val="Hyperlink"/>
           </w:rPr>
-          <w:t>Testing / Quality assurance</w:t>
+          <w:t>Progress control</w:t>
         </w:r>
         <w:r>
           <w:tab/>
@@ -1477,7 +1533,7 @@
           <w:fldChar w:fldCharType="begin"/>
         </w:r>
         <w:r>
-          <w:instrText xml:space="preserve">PAGEREF _Toc445770573 \h</w:instrText>
+          <w:instrText xml:space="preserve">PAGEREF _Toc1454625724 \h</w:instrText>
         </w:r>
         <w:r>
           <w:fldChar w:fldCharType="separate"/>
@@ -1486,7 +1542,7 @@
           <w:rPr>
             <w:rStyle w:val="Hyperlink"/>
           </w:rPr>
-          <w:t>12</w:t>
+          <w:t>13</w:t>
         </w:r>
         <w:r>
           <w:fldChar w:fldCharType="end"/>
@@ -1504,12 +1560,13 @@
           <w:rFonts w:ascii="Calibri" w:hAnsi="Calibri" w:asciiTheme="minorAscii" w:hAnsiTheme="minorAscii"/>
           <w:b w:val="0"/>
           <w:bCs w:val="0"/>
+          <w:noProof/>
           <w:kern w:val="2"/>
           <w:lang w:eastAsia="zh-CN"/>
           <w14:ligatures w14:val="standardContextual"/>
         </w:rPr>
       </w:pPr>
-      <w:hyperlink w:anchor="_Toc367261876">
+      <w:hyperlink w:anchor="_Toc219906693">
         <w:r>
           <w:rPr>
             <w:rStyle w:val="Hyperlink"/>
@@ -1523,7 +1580,7 @@
           <w:rPr>
             <w:rStyle w:val="Hyperlink"/>
           </w:rPr>
-          <w:t>Test cases</w:t>
+          <w:t>Resourcing</w:t>
         </w:r>
         <w:r>
           <w:tab/>
@@ -1532,7 +1589,7 @@
           <w:fldChar w:fldCharType="begin"/>
         </w:r>
         <w:r>
-          <w:instrText xml:space="preserve">PAGEREF _Toc367261876 \h</w:instrText>
+          <w:instrText xml:space="preserve">PAGEREF _Toc219906693 \h</w:instrText>
         </w:r>
         <w:r>
           <w:fldChar w:fldCharType="separate"/>
@@ -1541,7 +1598,7 @@
           <w:rPr>
             <w:rStyle w:val="Hyperlink"/>
           </w:rPr>
-          <w:t>13</w:t>
+          <w:t>14</w:t>
         </w:r>
         <w:r>
           <w:fldChar w:fldCharType="end"/>
@@ -1550,9 +1607,9 @@
     </w:p>
     <w:p>
       <w:pPr>
-        <w:pStyle w:val="TOC1"/>
+        <w:pStyle w:val="TOC2"/>
         <w:tabs>
-          <w:tab w:val="left" w:leader="none" w:pos="480"/>
+          <w:tab w:val="left" w:leader="none" w:pos="720"/>
           <w:tab w:val="right" w:leader="dot" w:pos="9900"/>
         </w:tabs>
         <w:rPr>
@@ -1565,12 +1622,12 @@
           <w14:ligatures w14:val="standardContextual"/>
         </w:rPr>
       </w:pPr>
-      <w:hyperlink w:anchor="_Toc83735894">
+      <w:hyperlink w:anchor="_Toc1836357937">
         <w:r>
           <w:rPr>
             <w:rStyle w:val="Hyperlink"/>
           </w:rPr>
-          <w:t>5</w:t>
+          <w:t>4.2</w:t>
         </w:r>
         <w:r>
           <w:tab/>
@@ -1579,7 +1636,7 @@
           <w:rPr>
             <w:rStyle w:val="Hyperlink"/>
           </w:rPr>
-          <w:t>Progress control</w:t>
+          <w:t>Preliminary schedule</w:t>
         </w:r>
         <w:r>
           <w:tab/>
@@ -1588,7 +1645,7 @@
           <w:fldChar w:fldCharType="begin"/>
         </w:r>
         <w:r>
-          <w:instrText xml:space="preserve">PAGEREF _Toc83735894 \h</w:instrText>
+          <w:instrText xml:space="preserve">PAGEREF _Toc1836357937 \h</w:instrText>
         </w:r>
         <w:r>
           <w:fldChar w:fldCharType="separate"/>
@@ -1597,7 +1654,7 @@
           <w:rPr>
             <w:rStyle w:val="Hyperlink"/>
           </w:rPr>
-          <w:t>13</w:t>
+          <w:t>15</w:t>
         </w:r>
         <w:r>
           <w:fldChar w:fldCharType="end"/>
@@ -1611,116 +1668,13 @@
           <w:tab w:val="left" w:leader="none" w:pos="720"/>
           <w:tab w:val="right" w:leader="dot" w:pos="9900"/>
         </w:tabs>
-        <w:rPr>
-          <w:rFonts w:ascii="Calibri" w:hAnsi="Calibri" w:asciiTheme="minorAscii" w:hAnsiTheme="minorAscii"/>
-          <w:b w:val="0"/>
-          <w:bCs w:val="0"/>
-          <w:noProof/>
-          <w:kern w:val="2"/>
-          <w:lang w:eastAsia="zh-CN"/>
-          <w14:ligatures w14:val="standardContextual"/>
-        </w:rPr>
-      </w:pPr>
-      <w:hyperlink w:anchor="_Toc585484150">
+      </w:pPr>
+      <w:hyperlink w:anchor="_Toc575538698">
         <w:r>
           <w:rPr>
             <w:rStyle w:val="Hyperlink"/>
           </w:rPr>
-          <w:t>5.1</w:t>
-        </w:r>
-        <w:r>
-          <w:tab/>
-        </w:r>
-        <w:r>
-          <w:rPr>
-            <w:rStyle w:val="Hyperlink"/>
-          </w:rPr>
-          <w:t>Resourcing</w:t>
-        </w:r>
-        <w:r>
-          <w:tab/>
-        </w:r>
-        <w:r>
-          <w:fldChar w:fldCharType="begin"/>
-        </w:r>
-        <w:r>
-          <w:instrText xml:space="preserve">PAGEREF _Toc585484150 \h</w:instrText>
-        </w:r>
-        <w:r>
-          <w:fldChar w:fldCharType="separate"/>
-        </w:r>
-        <w:r>
-          <w:rPr>
-            <w:rStyle w:val="Hyperlink"/>
-          </w:rPr>
-          <w:t>14</w:t>
-        </w:r>
-        <w:r>
-          <w:fldChar w:fldCharType="end"/>
-        </w:r>
-      </w:hyperlink>
-    </w:p>
-    <w:p>
-      <w:pPr>
-        <w:pStyle w:val="TOC2"/>
-        <w:tabs>
-          <w:tab w:val="left" w:leader="none" w:pos="720"/>
-          <w:tab w:val="right" w:leader="dot" w:pos="9900"/>
-        </w:tabs>
-      </w:pPr>
-      <w:hyperlink w:anchor="_Toc610773105">
-        <w:r>
-          <w:rPr>
-            <w:rStyle w:val="Hyperlink"/>
-          </w:rPr>
-          <w:t>5.2</w:t>
-        </w:r>
-        <w:r>
-          <w:tab/>
-        </w:r>
-        <w:r>
-          <w:rPr>
-            <w:rStyle w:val="Hyperlink"/>
-          </w:rPr>
-          <w:t>Preliminary schedule</w:t>
-        </w:r>
-        <w:r>
-          <w:tab/>
-        </w:r>
-        <w:r>
-          <w:fldChar w:fldCharType="begin"/>
-        </w:r>
-        <w:r>
-          <w:instrText xml:space="preserve">PAGEREF _Toc610773105 \h</w:instrText>
-        </w:r>
-        <w:r>
-          <w:fldChar w:fldCharType="separate"/>
-        </w:r>
-        <w:r>
-          <w:rPr>
-            <w:rStyle w:val="Hyperlink"/>
-          </w:rPr>
-          <w:t>15</w:t>
-        </w:r>
-        <w:r>
-          <w:fldChar w:fldCharType="end"/>
-        </w:r>
-      </w:hyperlink>
-    </w:p>
-    <w:p>
-      <w:pPr>
-        <w:pStyle w:val="TOC2"/>
-        <w:tabs>
-          <w:tab w:val="left" w:leader="none" w:pos="720"/>
-          <w:tab w:val="right" w:leader="dot" w:pos="9900"/>
-        </w:tabs>
-      </w:pPr>
-      <w:hyperlink w:anchor="_Toc1858705858">
-        <w:r>
-          <w:rPr>
-            <w:rStyle w:val="Hyperlink"/>
-          </w:rPr>
-          <w:t>5.3</w:t>
+          <w:t>4.3</w:t>
         </w:r>
         <w:r>
           <w:tab/>
@@ -1738,7 +1692,7 @@
           <w:fldChar w:fldCharType="begin"/>
         </w:r>
         <w:r>
-          <w:instrText xml:space="preserve">PAGEREF _Toc1858705858 \h</w:instrText>
+          <w:instrText xml:space="preserve">PAGEREF _Toc575538698 \h</w:instrText>
         </w:r>
         <w:r>
           <w:fldChar w:fldCharType="separate"/>
@@ -1789,12 +1743,12 @@
         <w:pStyle w:val="Heading1"/>
         <w:rPr/>
       </w:pPr>
-      <w:bookmarkStart w:name="_Toc2096315382" w:id="1029066550"/>
+      <w:bookmarkStart w:name="_Toc32094059" w:id="756409718"/>
       <w:r>
         <w:rPr/>
         <w:t>INTRODUCTION</w:t>
       </w:r>
-      <w:bookmarkEnd w:id="1029066550"/>
+      <w:bookmarkEnd w:id="756409718"/>
     </w:p>
     <w:p>
       <w:pPr>
@@ -1890,12 +1844,12 @@
         <w:pStyle w:val="Heading1"/>
         <w:rPr/>
       </w:pPr>
-      <w:bookmarkStart w:name="_Toc432247473" w:id="73219394"/>
+      <w:bookmarkStart w:name="_Toc1288870773" w:id="1183542640"/>
       <w:r>
         <w:rPr/>
         <w:t>Team formation</w:t>
       </w:r>
-      <w:bookmarkEnd w:id="73219394"/>
+      <w:bookmarkEnd w:id="1183542640"/>
     </w:p>
     <w:p>
       <w:pPr>
@@ -1904,7 +1858,7 @@
           <w:lang w:val="fi-FI"/>
         </w:rPr>
       </w:pPr>
-      <w:bookmarkStart w:name="_Toc641023352" w:id="2026805941"/>
+      <w:bookmarkStart w:name="_Toc917729410" w:id="2101757942"/>
       <w:r>
         <w:rPr>
           <w:lang w:val="fi-FI"/>
@@ -1917,7 +1871,7 @@
         </w:rPr>
         <w:t>members</w:t>
       </w:r>
-      <w:bookmarkEnd w:id="2026805941"/>
+      <w:bookmarkEnd w:id="2101757942"/>
     </w:p>
     <w:p>
       <w:pPr>
@@ -2081,7 +2035,7 @@
           <w:lang w:val="fi-FI"/>
         </w:rPr>
       </w:pPr>
-      <w:bookmarkStart w:name="_Toc1673774202" w:id="1783331042"/>
+      <w:bookmarkStart w:name="_Toc1600587042" w:id="1785287409"/>
       <w:r>
         <w:rPr>
           <w:lang w:val="fi-FI"/>
@@ -2106,7 +2060,7 @@
         </w:rPr>
         <w:t>lities</w:t>
       </w:r>
-      <w:bookmarkEnd w:id="1783331042"/>
+      <w:bookmarkEnd w:id="1785287409"/>
     </w:p>
     <w:p>
       <w:pPr>
@@ -2338,12 +2292,12 @@
         <w:pStyle w:val="Heading1"/>
         <w:rPr/>
       </w:pPr>
-      <w:bookmarkStart w:name="_Toc1455808958" w:id="1496730315"/>
+      <w:bookmarkStart w:name="_Toc629860699" w:id="388323016"/>
       <w:r>
         <w:rPr/>
         <w:t>PROJECT DESIGN</w:t>
       </w:r>
-      <w:bookmarkEnd w:id="1496730315"/>
+      <w:bookmarkEnd w:id="388323016"/>
     </w:p>
     <w:p>
       <w:pPr>
@@ -2496,12 +2450,24 @@
         <w:rPr>
           <w:rFonts w:cs="Times New Roman"/>
         </w:rPr>
-        <w:t xml:space="preserve"> questions </w:t>
+        <w:t xml:space="preserve"> questions</w:t>
       </w:r>
       <w:r>
         <w:rPr>
           <w:rFonts w:cs="Times New Roman"/>
         </w:rPr>
+        <w:t>,</w:t>
+      </w:r>
+      <w:r>
+        <w:rPr>
+          <w:rFonts w:cs="Times New Roman"/>
+        </w:rPr>
+        <w:t xml:space="preserve"> </w:t>
+      </w:r>
+      <w:r>
+        <w:rPr>
+          <w:rFonts w:cs="Times New Roman"/>
+        </w:rPr>
         <w:t xml:space="preserve">to check if </w:t>
       </w:r>
       <w:r>
@@ -2520,12 +2486,24 @@
         <w:rPr>
           <w:rFonts w:cs="Times New Roman"/>
         </w:rPr>
-        <w:t xml:space="preserve">have actually read the book. If </w:t>
+        <w:t xml:space="preserve">have </w:t>
       </w:r>
       <w:r>
         <w:rPr>
           <w:rFonts w:cs="Times New Roman"/>
         </w:rPr>
+        <w:t>actually read</w:t>
+      </w:r>
+      <w:r>
+        <w:rPr>
+          <w:rFonts w:cs="Times New Roman"/>
+        </w:rPr>
+        <w:t xml:space="preserve"> the book. If </w:t>
+      </w:r>
+      <w:r>
+        <w:rPr>
+          <w:rFonts w:cs="Times New Roman"/>
+        </w:rPr>
         <w:t xml:space="preserve">they answer </w:t>
       </w:r>
       <w:r>
@@ -2550,7 +2528,19 @@
         <w:rPr>
           <w:rFonts w:cs="Times New Roman"/>
         </w:rPr>
-        <w:t xml:space="preserve"> After completing all the levels the teacher/parents could confirm that all the books have been read based on the answers provide</w:t>
+        <w:t xml:space="preserve"> After completing all the levels</w:t>
+      </w:r>
+      <w:r>
+        <w:rPr>
+          <w:rFonts w:cs="Times New Roman"/>
+        </w:rPr>
+        <w:t>,</w:t>
+      </w:r>
+      <w:r>
+        <w:rPr>
+          <w:rFonts w:cs="Times New Roman"/>
+        </w:rPr>
+        <w:t xml:space="preserve"> the teacher/parents could confirm that all the books have been read based on the answers provide</w:t>
       </w:r>
       <w:r>
         <w:rPr>
@@ -2590,7 +2580,7 @@
         <w:pStyle w:val="Heading2"/>
         <w:rPr/>
       </w:pPr>
-      <w:bookmarkStart w:name="_Toc1056749410" w:id="1480154752"/>
+      <w:bookmarkStart w:name="_Toc1684818426" w:id="971609698"/>
       <w:r>
         <w:rPr/>
         <w:t>Client h</w:t>
@@ -2611,7 +2601,7 @@
         <w:rPr/>
         <w:t>hallenges to consider</w:t>
       </w:r>
-      <w:bookmarkEnd w:id="1480154752"/>
+      <w:bookmarkEnd w:id="971609698"/>
     </w:p>
     <w:p>
       <w:pPr>
@@ -2821,9 +2811,23 @@
           <w:ilvl w:val="0"/>
           <w:numId w:val="13"/>
         </w:numPr>
-      </w:pPr>
-      <w:r>
-        <w:t>Seamless video integrations.</w:t>
+        <w:rPr/>
+      </w:pPr>
+      <w:r>
+        <w:rPr/>
+        <w:t>How do we implement s</w:t>
+      </w:r>
+      <w:r>
+        <w:rPr/>
+        <w:t xml:space="preserve">eamless video </w:t>
+      </w:r>
+      <w:r>
+        <w:rPr/>
+        <w:t>integrations</w:t>
+      </w:r>
+      <w:r>
+        <w:rPr/>
+        <w:t>?</w:t>
       </w:r>
     </w:p>
     <w:p>
@@ -2845,30 +2849,19 @@
           <w:ilvl w:val="0"/>
           <w:numId w:val="13"/>
         </w:numPr>
-      </w:pPr>
-      <w:r>
+        <w:rPr/>
+      </w:pPr>
+      <w:r>
+        <w:rPr/>
         <w:t xml:space="preserve">Should we create concept </w:t>
       </w:r>
       <w:r>
+        <w:rPr/>
         <w:t>art</w:t>
       </w:r>
       <w:r>
+        <w:rPr/>
         <w:t xml:space="preserve"> ourselves?</w:t>
-      </w:r>
-    </w:p>
-    <w:p>
-      <w:pPr>
-        <w:pStyle w:val="ListParagraph"/>
-        <w:numPr>
-          <w:ilvl w:val="0"/>
-          <w:numId w:val="13"/>
-        </w:numPr>
-      </w:pPr>
-      <w:r>
-        <w:t xml:space="preserve">Should the chosen avatar be the </w:t>
-      </w:r>
-      <w:r>
-        <w:t>“player” that moves throughout the map?</w:t>
       </w:r>
     </w:p>
     <w:p>
@@ -2884,12 +2877,12 @@
         <w:pStyle w:val="Heading2"/>
         <w:rPr/>
       </w:pPr>
-      <w:bookmarkStart w:name="_Toc1961304100" w:id="925576248"/>
+      <w:bookmarkStart w:name="_Toc2079402666" w:id="1602771909"/>
       <w:r>
         <w:rPr/>
         <w:t>Technologies</w:t>
       </w:r>
-      <w:bookmarkEnd w:id="925576248"/>
+      <w:bookmarkEnd w:id="1602771909"/>
     </w:p>
     <w:p/>
     <w:p>
@@ -3055,200 +3048,9 @@
     </w:p>
     <w:p>
       <w:pPr>
-        <w:spacing w:line="360" w:lineRule="auto"/>
-        <w:rPr>
-          <w:lang w:eastAsia="zh-CN"/>
-        </w:rPr>
-      </w:pPr>
-    </w:p>
-    <w:p>
-      <w:pPr>
         <w:pStyle w:val="ListParagraph"/>
-        <w:numPr>
-          <w:ilvl w:val="0"/>
-          <w:numId w:val="2"/>
-        </w:numPr>
-        <w:spacing w:line="360" w:lineRule="auto"/>
-        <w:ind w:left="720"/>
-        <w:rPr>
-          <w:lang w:eastAsia="zh-CN"/>
-        </w:rPr>
-      </w:pPr>
-      <w:r>
-        <w:rPr>
-          <w:lang w:eastAsia="zh-CN"/>
-        </w:rPr>
-        <w:t>Next.js</w:t>
-      </w:r>
-    </w:p>
-    <w:p>
-      <w:pPr>
-        <w:pStyle w:val="ListParagraph"/>
-        <w:spacing w:line="360" w:lineRule="auto"/>
-        <w:ind w:left="0"/>
-        <w:rPr>
-          <w:lang w:eastAsia="zh-CN"/>
-        </w:rPr>
-      </w:pPr>
-      <w:r>
-        <w:rPr>
-          <w:lang w:eastAsia="zh-CN"/>
-        </w:rPr>
-        <w:t xml:space="preserve">Next.js is a React framework that has added features and support for TypeScript. </w:t>
-      </w:r>
-      <w:r>
-        <w:rPr>
-          <w:lang w:eastAsia="zh-CN"/>
-        </w:rPr>
-        <w:t xml:space="preserve">We could use Next.js for the frontend as it supports </w:t>
-      </w:r>
-      <w:r>
-        <w:rPr>
-          <w:lang w:eastAsia="zh-CN"/>
-        </w:rPr>
-        <w:t>both TypeScript and React</w:t>
-      </w:r>
-      <w:r>
-        <w:rPr>
-          <w:lang w:eastAsia="zh-CN"/>
-        </w:rPr>
-        <w:t xml:space="preserve">. </w:t>
-      </w:r>
-      <w:r>
-        <w:rPr>
-          <w:lang w:eastAsia="zh-CN"/>
-        </w:rPr>
-        <w:t>D</w:t>
-      </w:r>
-      <w:r>
-        <w:rPr>
-          <w:lang w:eastAsia="zh-CN"/>
-        </w:rPr>
-        <w:t>irectly</w:t>
-      </w:r>
-      <w:r>
-        <w:rPr>
-          <w:lang w:eastAsia="zh-CN"/>
-        </w:rPr>
-        <w:t xml:space="preserve"> import</w:t>
-      </w:r>
-      <w:r>
-        <w:rPr>
-          <w:lang w:eastAsia="zh-CN"/>
-        </w:rPr>
-        <w:t>ing</w:t>
-      </w:r>
-      <w:r>
-        <w:rPr>
-          <w:lang w:eastAsia="zh-CN"/>
-        </w:rPr>
-        <w:t xml:space="preserve"> a UI made with Figma</w:t>
-      </w:r>
-      <w:r>
-        <w:rPr>
-          <w:lang w:eastAsia="zh-CN"/>
-        </w:rPr>
-        <w:t xml:space="preserve"> would be possible</w:t>
-      </w:r>
-      <w:r>
-        <w:rPr>
-          <w:lang w:eastAsia="zh-CN"/>
-        </w:rPr>
-        <w:t xml:space="preserve">. </w:t>
-      </w:r>
-      <w:r>
-        <w:rPr>
-          <w:lang w:eastAsia="zh-CN"/>
-        </w:rPr>
-        <w:t xml:space="preserve">Navigating between pages also </w:t>
-      </w:r>
-      <w:r>
-        <w:rPr>
-          <w:lang w:eastAsia="zh-CN"/>
-        </w:rPr>
-        <w:t>seems</w:t>
-      </w:r>
-      <w:r>
-        <w:rPr>
-          <w:lang w:eastAsia="zh-CN"/>
-        </w:rPr>
-        <w:t xml:space="preserve"> </w:t>
-      </w:r>
-      <w:r>
-        <w:rPr>
-          <w:lang w:eastAsia="zh-CN"/>
-        </w:rPr>
-        <w:t xml:space="preserve">easier </w:t>
-      </w:r>
-      <w:r>
-        <w:rPr>
-          <w:lang w:eastAsia="zh-CN"/>
-        </w:rPr>
-        <w:t>and more intuitive</w:t>
-      </w:r>
-      <w:r>
-        <w:rPr>
-          <w:lang w:eastAsia="zh-CN"/>
-        </w:rPr>
-        <w:t xml:space="preserve">. </w:t>
-      </w:r>
-      <w:r>
-        <w:rPr>
-          <w:lang w:eastAsia="zh-CN"/>
-        </w:rPr>
-        <w:t>Easy to share UI elements across multiple pages (</w:t>
-      </w:r>
-      <w:r>
-        <w:rPr>
-          <w:lang w:eastAsia="zh-CN"/>
-        </w:rPr>
-        <w:t>e.g.</w:t>
-      </w:r>
-      <w:r>
-        <w:rPr>
-          <w:lang w:eastAsia="zh-CN"/>
-        </w:rPr>
-        <w:t xml:space="preserve"> navigation bar).</w:t>
-      </w:r>
-      <w:r>
-        <w:rPr>
-          <w:lang w:eastAsia="zh-CN"/>
-        </w:rPr>
-        <w:t xml:space="preserve"> Some libraries for animation: Framer Motion and Lottie</w:t>
-      </w:r>
-      <w:r>
-        <w:rPr>
-          <w:lang w:eastAsia="zh-CN"/>
-        </w:rPr>
-        <w:t xml:space="preserve"> (</w:t>
-      </w:r>
-      <w:hyperlink r:id="R9c81efa8a9c54682">
-        <w:r>
-          <w:rPr>
-            <w:rStyle w:val="Hyperlink"/>
-            <w:lang w:eastAsia="zh-CN"/>
-          </w:rPr>
-          <w:t>https://lottiefiles.com/featured-free-animations</w:t>
-        </w:r>
-      </w:hyperlink>
-      <w:r>
-        <w:rPr>
-          <w:lang w:eastAsia="zh-CN"/>
-        </w:rPr>
-        <w:t>)</w:t>
-      </w:r>
-      <w:r>
-        <w:rPr>
-          <w:lang w:eastAsia="zh-CN"/>
-        </w:rPr>
-        <w:t>.</w:t>
-      </w:r>
-    </w:p>
-    <w:p>
-      <w:pPr>
-        <w:pStyle w:val="ListParagraph"/>
-        <w:spacing w:line="360" w:lineRule="auto"/>
-        <w:ind w:left="0"/>
+        <w:spacing w:line="360" w:lineRule="auto"/>
+        <w:ind/>
         <w:rPr>
           <w:lang w:eastAsia="zh-CN"/>
         </w:rPr>
@@ -3414,19 +3216,6 @@
     <w:p>
       <w:pPr>
         <w:pStyle w:val="ListParagraph"/>
-        <w:suppressLineNumbers w:val="0"/>
-        <w:bidi w:val="0"/>
-        <w:spacing w:before="0" w:beforeAutospacing="off" w:after="0" w:afterAutospacing="off" w:line="360" w:lineRule="auto"/>
-        <w:ind w:left="0" w:right="0" w:hanging="0"/>
-        <w:jc w:val="left"/>
-        <w:rPr>
-          <w:lang w:eastAsia="zh-CN"/>
-        </w:rPr>
-      </w:pPr>
-    </w:p>
-    <w:p>
-      <w:pPr>
-        <w:pStyle w:val="ListParagraph"/>
         <w:spacing w:line="360" w:lineRule="auto"/>
         <w:ind w:left="1080"/>
         <w:rPr>
@@ -3882,12 +3671,12 @@
         <w:pStyle w:val="Heading2"/>
         <w:rPr/>
       </w:pPr>
-      <w:bookmarkStart w:name="_Toc1534019633" w:id="1444312692"/>
+      <w:bookmarkStart w:name="_Toc334642722" w:id="1523054179"/>
       <w:r>
         <w:rPr/>
         <w:t>Architecture</w:t>
       </w:r>
-      <w:bookmarkEnd w:id="1444312692"/>
+      <w:bookmarkEnd w:id="1523054179"/>
     </w:p>
     <w:p/>
     <w:p>
@@ -3895,7 +3684,7 @@
         <w:pStyle w:val="Heading3"/>
         <w:rPr/>
       </w:pPr>
-      <w:bookmarkStart w:name="_Toc1153723539" w:id="1953343949"/>
+      <w:bookmarkStart w:name="_Toc1436348381" w:id="2036336123"/>
       <w:r>
         <w:rPr/>
         <w:t xml:space="preserve">Overall </w:t>
@@ -3904,7 +3693,7 @@
         <w:rPr/>
         <w:t>architecture</w:t>
       </w:r>
-      <w:bookmarkEnd w:id="1953343949"/>
+      <w:bookmarkEnd w:id="2036336123"/>
     </w:p>
     <w:p>
       <w:pPr>
@@ -3947,45 +3736,156 @@
         <w:rPr>
           <w:lang w:eastAsia="zh-CN"/>
         </w:rPr>
+        <w:t>.</w:t>
+      </w:r>
+    </w:p>
+    <w:p>
+      <w:pPr>
+        <w:rPr>
+          <w:lang w:eastAsia="zh-CN"/>
+        </w:rPr>
+      </w:pPr>
+    </w:p>
+    <w:p>
+      <w:pPr>
+        <w:pStyle w:val="Normal"/>
+        <w:suppressLineNumbers w:val="0"/>
+        <w:bidi w:val="0"/>
+        <w:spacing w:before="0" w:beforeAutospacing="off" w:after="0" w:afterAutospacing="off" w:line="259" w:lineRule="auto"/>
+        <w:ind w:left="0" w:right="0"/>
+        <w:jc w:val="left"/>
+        <w:rPr>
+          <w:lang w:eastAsia="zh-CN"/>
+        </w:rPr>
+      </w:pPr>
+      <w:r>
+        <w:rPr>
+          <w:lang w:eastAsia="zh-CN"/>
+        </w:rPr>
+        <w:t>Student/teacher</w:t>
+      </w:r>
+      <w:r>
+        <w:rPr>
+          <w:lang w:eastAsia="zh-CN"/>
+        </w:rPr>
+        <w:t xml:space="preserve"> (Tablet / PC)</w:t>
+      </w:r>
+    </w:p>
+    <w:p>
+      <w:pPr>
+        <w:rPr>
+          <w:lang w:eastAsia="zh-CN"/>
+        </w:rPr>
+      </w:pPr>
+      <w:r>
+        <w:rPr>
+          <w:rFonts w:hint="eastAsia"/>
+          <w:lang w:eastAsia="zh-CN"/>
+        </w:rPr>
+        <w:t xml:space="preserve">        </w:t>
+      </w:r>
+      <w:r>
+        <w:rPr>
+          <w:rFonts w:hint="eastAsia"/>
+          <w:lang w:eastAsia="zh-CN"/>
+        </w:rPr>
+        <w:t>│</w:t>
+      </w:r>
+    </w:p>
+    <w:p>
+      <w:pPr>
+        <w:rPr>
+          <w:lang w:eastAsia="zh-CN"/>
+        </w:rPr>
+      </w:pPr>
+      <w:r>
+        <w:rPr>
+          <w:rFonts w:hint="eastAsia"/>
+          <w:lang w:eastAsia="zh-CN"/>
+        </w:rPr>
+        <w:t xml:space="preserve">        </w:t>
+      </w:r>
+      <w:r>
+        <w:rPr>
+          <w:rFonts w:hint="eastAsia"/>
+          <w:lang w:eastAsia="zh-CN"/>
+        </w:rPr>
+        <w:t>▼</w:t>
+      </w:r>
+    </w:p>
+    <w:p>
+      <w:pPr>
+        <w:rPr>
+          <w:lang w:eastAsia="zh-CN"/>
+        </w:rPr>
+      </w:pPr>
+      <w:r>
+        <w:rPr>
+          <w:lang w:eastAsia="zh-CN"/>
+        </w:rPr>
+        <w:t>Web</w:t>
+      </w:r>
+      <w:r>
+        <w:rPr>
+          <w:lang w:eastAsia="zh-CN"/>
+        </w:rPr>
         <w:t xml:space="preserve"> </w:t>
       </w:r>
       <w:r>
         <w:rPr>
           <w:lang w:eastAsia="zh-CN"/>
         </w:rPr>
-        <w:t>(</w:t>
-      </w:r>
-      <w:r>
-        <w:rPr>
-          <w:lang w:eastAsia="zh-CN"/>
-        </w:rPr>
-        <w:t>generated by AI)</w:t>
-      </w:r>
-      <w:r>
-        <w:rPr>
-          <w:lang w:eastAsia="zh-CN"/>
-        </w:rPr>
-        <w:t>.</w:t>
-      </w:r>
-    </w:p>
-    <w:p>
-      <w:pPr>
-        <w:rPr>
-          <w:lang w:eastAsia="zh-CN"/>
-        </w:rPr>
-      </w:pPr>
-    </w:p>
-    <w:p>
-      <w:pPr>
-        <w:rPr>
-          <w:lang w:eastAsia="zh-CN"/>
-        </w:rPr>
-      </w:pPr>
-      <w:r>
-        <w:rPr>
-          <w:lang w:eastAsia="zh-CN"/>
-        </w:rPr>
-        <w:t>Child (Tablet / PC)</w:t>
+        <w:t>Interface</w:t>
+      </w:r>
+      <w:r>
+        <w:rPr>
+          <w:lang w:eastAsia="zh-CN"/>
+        </w:rPr>
+        <w:t xml:space="preserve"> </w:t>
+      </w:r>
+      <w:r>
+        <w:rPr>
+          <w:lang w:eastAsia="zh-CN"/>
+        </w:rPr>
+        <w:t>(Frontend)</w:t>
+      </w:r>
+    </w:p>
+    <w:p>
+      <w:pPr>
+        <w:pStyle w:val="Normal"/>
+        <w:rPr>
+          <w:lang w:eastAsia="zh-CN"/>
+        </w:rPr>
+      </w:pPr>
+      <w:r>
+        <w:rPr>
+          <w:lang w:eastAsia="zh-CN"/>
+        </w:rPr>
+        <w:t xml:space="preserve">        </w:t>
+      </w:r>
+      <w:r>
+        <w:rPr>
+          <w:lang w:eastAsia="zh-CN"/>
+        </w:rPr>
+        <w:t>│</w:t>
+      </w:r>
+      <w:r>
+        <w:rPr>
+          <w:lang w:eastAsia="zh-CN"/>
+        </w:rPr>
+        <w:t xml:space="preserve">  </w:t>
+      </w:r>
+      <w:r>
+        <w:rPr>
+          <w:lang w:eastAsia="zh-CN"/>
+        </w:rPr>
+        <w:t>React.js</w:t>
+      </w:r>
+      <w:r>
+        <w:rPr>
+          <w:lang w:eastAsia="zh-CN"/>
+        </w:rPr>
+        <w:t>, Phaser</w:t>
       </w:r>
     </w:p>
     <w:p>
@@ -4006,6 +3906,52 @@
           <w:rFonts w:hint="eastAsia"/>
           <w:lang w:eastAsia="zh-CN"/>
         </w:rPr>
+        <w:t>▼</w:t>
+      </w:r>
+    </w:p>
+    <w:p>
+      <w:pPr>
+        <w:rPr>
+          <w:lang w:eastAsia="zh-CN"/>
+        </w:rPr>
+      </w:pPr>
+      <w:r>
+        <w:rPr>
+          <w:lang w:eastAsia="zh-CN"/>
+        </w:rPr>
+        <w:t>Backend Server</w:t>
+      </w:r>
+      <w:r>
+        <w:rPr>
+          <w:lang w:eastAsia="zh-CN"/>
+        </w:rPr>
+        <w:t xml:space="preserve"> – Node.js </w:t>
+      </w:r>
+      <w:r>
+        <w:rPr>
+          <w:lang w:eastAsia="zh-CN"/>
+        </w:rPr>
+        <w:t>(Game Logic &amp; Data)</w:t>
+      </w:r>
+    </w:p>
+    <w:p>
+      <w:pPr>
+        <w:rPr>
+          <w:lang w:eastAsia="zh-CN"/>
+        </w:rPr>
+      </w:pPr>
+      <w:r>
+        <w:rPr>
+          <w:rFonts w:hint="eastAsia"/>
+          <w:lang w:eastAsia="zh-CN"/>
+        </w:rPr>
+        <w:t xml:space="preserve">        </w:t>
+      </w:r>
+      <w:r>
+        <w:rPr>
+          <w:rFonts w:hint="eastAsia"/>
+          <w:lang w:eastAsia="zh-CN"/>
+        </w:rPr>
         <w:t>│</w:t>
       </w:r>
     </w:p>
@@ -4017,190 +3963,55 @@
       </w:pPr>
       <w:r>
         <w:rPr>
-          <w:rFonts w:hint="eastAsia"/>
           <w:lang w:eastAsia="zh-CN"/>
         </w:rPr>
         <w:t xml:space="preserve">        </w:t>
       </w:r>
       <w:r>
         <w:rPr>
-          <w:rFonts w:hint="eastAsia"/>
-          <w:lang w:eastAsia="zh-CN"/>
-        </w:rPr>
-        <w:t>▼</w:t>
-      </w:r>
-    </w:p>
-    <w:p>
-      <w:pPr>
-        <w:rPr>
-          <w:lang w:eastAsia="zh-CN"/>
-        </w:rPr>
-      </w:pPr>
-      <w:r>
-        <w:rPr>
-          <w:lang w:eastAsia="zh-CN"/>
-        </w:rPr>
-        <w:t>Web</w:t>
-      </w:r>
-      <w:r>
-        <w:rPr>
-          <w:lang w:eastAsia="zh-CN"/>
-        </w:rPr>
-        <w:t xml:space="preserve"> </w:t>
-      </w:r>
-      <w:r>
-        <w:rPr>
-          <w:lang w:eastAsia="zh-CN"/>
-        </w:rPr>
-        <w:t>Interface</w:t>
-      </w:r>
-      <w:r>
-        <w:rPr>
-          <w:lang w:eastAsia="zh-CN"/>
-        </w:rPr>
-        <w:t xml:space="preserve"> </w:t>
-      </w:r>
-      <w:r>
-        <w:rPr>
-          <w:lang w:eastAsia="zh-CN"/>
-        </w:rPr>
-        <w:t>(Frontend)</w:t>
-      </w:r>
-    </w:p>
-    <w:p>
-      <w:pPr>
-        <w:rPr>
-          <w:lang w:eastAsia="zh-CN"/>
-        </w:rPr>
-      </w:pPr>
-      <w:r>
-        <w:rPr>
-          <w:rFonts w:hint="eastAsia"/>
+          <w:lang w:eastAsia="zh-CN"/>
+        </w:rPr>
+        <w:t>├──</w:t>
+      </w:r>
+      <w:r>
+        <w:rPr>
+          <w:lang w:eastAsia="zh-CN"/>
+        </w:rPr>
+        <w:t xml:space="preserve"> Database</w:t>
+      </w:r>
+      <w:r>
+        <w:rPr>
+          <w:lang w:eastAsia="zh-CN"/>
+        </w:rPr>
+        <w:t xml:space="preserve"> – PostgreSQL </w:t>
+      </w:r>
+      <w:r>
+        <w:rPr>
+          <w:lang w:eastAsia="zh-CN"/>
+        </w:rPr>
+        <w:t>(Users, Books, Progress)</w:t>
+      </w:r>
+    </w:p>
+    <w:p>
+      <w:pPr>
+        <w:rPr>
+          <w:lang w:eastAsia="zh-CN"/>
+        </w:rPr>
+      </w:pPr>
+      <w:r>
+        <w:rPr>
           <w:lang w:eastAsia="zh-CN"/>
         </w:rPr>
         <w:t xml:space="preserve">        </w:t>
       </w:r>
       <w:r>
         <w:rPr>
-          <w:rFonts w:hint="eastAsia"/>
-          <w:lang w:eastAsia="zh-CN"/>
-        </w:rPr>
-        <w:t>│</w:t>
-      </w:r>
-      <w:r>
-        <w:rPr>
-          <w:rFonts w:hint="eastAsia"/>
-          <w:lang w:eastAsia="zh-CN"/>
-        </w:rPr>
-        <w:t xml:space="preserve">  HTTPS REST API</w:t>
-      </w:r>
-    </w:p>
-    <w:p>
-      <w:pPr>
-        <w:rPr>
-          <w:lang w:eastAsia="zh-CN"/>
-        </w:rPr>
-      </w:pPr>
-      <w:r>
-        <w:rPr>
-          <w:rFonts w:hint="eastAsia"/>
-          <w:lang w:eastAsia="zh-CN"/>
-        </w:rPr>
-        <w:t xml:space="preserve">        </w:t>
-      </w:r>
-      <w:r>
-        <w:rPr>
-          <w:rFonts w:hint="eastAsia"/>
-          <w:lang w:eastAsia="zh-CN"/>
-        </w:rPr>
-        <w:t>▼</w:t>
-      </w:r>
-    </w:p>
-    <w:p>
-      <w:pPr>
-        <w:rPr>
-          <w:lang w:eastAsia="zh-CN"/>
-        </w:rPr>
-      </w:pPr>
-      <w:r>
-        <w:rPr>
-          <w:lang w:eastAsia="zh-CN"/>
-        </w:rPr>
-        <w:t>Backend Server (Game Logic &amp; Data)</w:t>
-      </w:r>
-    </w:p>
-    <w:p>
-      <w:pPr>
-        <w:rPr>
-          <w:lang w:eastAsia="zh-CN"/>
-        </w:rPr>
-      </w:pPr>
-      <w:r>
-        <w:rPr>
-          <w:rFonts w:hint="eastAsia"/>
-          <w:lang w:eastAsia="zh-CN"/>
-        </w:rPr>
-        <w:t xml:space="preserve">        </w:t>
-      </w:r>
-      <w:r>
-        <w:rPr>
-          <w:rFonts w:hint="eastAsia"/>
-          <w:lang w:eastAsia="zh-CN"/>
-        </w:rPr>
-        <w:t>│</w:t>
-      </w:r>
-    </w:p>
-    <w:p>
-      <w:pPr>
-        <w:rPr>
-          <w:lang w:eastAsia="zh-CN"/>
-        </w:rPr>
-      </w:pPr>
-      <w:r>
-        <w:rPr>
-          <w:rFonts w:hint="eastAsia"/>
-          <w:lang w:eastAsia="zh-CN"/>
-        </w:rPr>
-        <w:t xml:space="preserve">        </w:t>
-      </w:r>
-      <w:r>
-        <w:rPr>
-          <w:rFonts w:hint="eastAsia"/>
-          <w:lang w:eastAsia="zh-CN"/>
-        </w:rPr>
-        <w:t>├──</w:t>
-      </w:r>
-      <w:r>
-        <w:rPr>
-          <w:rFonts w:hint="eastAsia"/>
-          <w:lang w:eastAsia="zh-CN"/>
-        </w:rPr>
-        <w:t xml:space="preserve"> Database (Users, Books, Progress)</w:t>
-      </w:r>
-    </w:p>
-    <w:p>
-      <w:pPr>
-        <w:rPr>
-          <w:lang w:eastAsia="zh-CN"/>
-        </w:rPr>
-      </w:pPr>
-      <w:r>
-        <w:rPr>
-          <w:rFonts w:hint="eastAsia"/>
-          <w:lang w:eastAsia="zh-CN"/>
-        </w:rPr>
-        <w:t xml:space="preserve">        </w:t>
-      </w:r>
-      <w:r>
-        <w:rPr>
-          <w:rFonts w:hint="eastAsia"/>
           <w:lang w:eastAsia="zh-CN"/>
         </w:rPr>
         <w:t>└──</w:t>
       </w:r>
       <w:r>
         <w:rPr>
-          <w:rFonts w:hint="eastAsia"/>
           <w:lang w:eastAsia="zh-CN"/>
         </w:rPr>
         <w:t xml:space="preserve"> External Services (Text-to-Speech, Content Storage)</w:t>
@@ -4208,155 +4019,6 @@
     </w:p>
     <w:p>
       <w:pPr>
-        <w:rPr>
-          <w:lang w:eastAsia="zh-CN"/>
-        </w:rPr>
-      </w:pPr>
-    </w:p>
-    <w:p>
-      <w:pPr>
-        <w:spacing w:line="360" w:lineRule="auto"/>
-        <w:rPr>
-          <w:lang w:eastAsia="zh-CN"/>
-        </w:rPr>
-      </w:pPr>
-      <w:r>
-        <w:rPr>
-          <w:lang w:eastAsia="zh-CN"/>
-        </w:rPr>
-        <w:t>Should the architecture look like this if we’re using Godot for the frontend?</w:t>
-      </w:r>
-    </w:p>
-    <w:p>
-      <w:pPr>
-        <w:spacing w:line="360" w:lineRule="auto"/>
-        <w:rPr>
-          <w:lang w:eastAsia="zh-CN"/>
-        </w:rPr>
-      </w:pPr>
-      <w:r>
-        <w:rPr>
-          <w:lang w:eastAsia="zh-CN"/>
-        </w:rPr>
-        <w:t>Project architecture?</w:t>
-      </w:r>
-    </w:p>
-    <w:p>
-      <w:pPr>
-        <w:spacing w:line="360" w:lineRule="auto"/>
-      </w:pPr>
-      <w:r>
-        <w:rPr>
-          <w:lang w:eastAsia="zh-CN"/>
-        </w:rPr>
-        <w:t xml:space="preserve">        │</w:t>
-      </w:r>
-    </w:p>
-    <w:p>
-      <w:pPr>
-        <w:spacing w:line="360" w:lineRule="auto"/>
-        <w:rPr>
-          <w:lang w:eastAsia="zh-CN"/>
-        </w:rPr>
-      </w:pPr>
-      <w:r>
-        <w:rPr>
-          <w:lang w:eastAsia="zh-CN"/>
-        </w:rPr>
-        <w:t xml:space="preserve">        ├── Documentation/ (flow-charts, planning etc.)</w:t>
-      </w:r>
-    </w:p>
-    <w:p>
-      <w:pPr>
-        <w:spacing w:line="360" w:lineRule="auto"/>
-        <w:rPr>
-          <w:lang w:eastAsia="zh-CN"/>
-        </w:rPr>
-      </w:pPr>
-      <w:r>
-        <w:rPr>
-          <w:lang w:eastAsia="zh-CN"/>
-        </w:rPr>
-        <w:t xml:space="preserve">        ├── Frontend/ (</w:t>
-      </w:r>
-      <w:r>
-        <w:rPr>
-          <w:lang w:eastAsia="zh-CN"/>
-        </w:rPr>
-        <w:t>React.js</w:t>
-      </w:r>
-      <w:r>
-        <w:rPr>
-          <w:lang w:eastAsia="zh-CN"/>
-        </w:rPr>
-        <w:t>, Phaser</w:t>
-      </w:r>
-      <w:r>
-        <w:rPr>
-          <w:lang w:eastAsia="zh-CN"/>
-        </w:rPr>
-        <w:t>)</w:t>
-      </w:r>
-    </w:p>
-    <w:p>
-      <w:pPr>
-        <w:pStyle w:val="Normal"/>
-        <w:spacing w:line="360" w:lineRule="auto"/>
-        <w:rPr>
-          <w:lang w:eastAsia="zh-CN"/>
-        </w:rPr>
-      </w:pPr>
-      <w:r>
-        <w:rPr>
-          <w:lang w:eastAsia="zh-CN"/>
-        </w:rPr>
-        <w:t xml:space="preserve">        </w:t>
-      </w:r>
-      <w:r>
-        <w:rPr>
-          <w:lang w:eastAsia="zh-CN"/>
-        </w:rPr>
-        <w:t>└</w:t>
-      </w:r>
-      <w:r>
-        <w:rPr>
-          <w:lang w:eastAsia="zh-CN"/>
-        </w:rPr>
-        <w:t>──</w:t>
-      </w:r>
-      <w:r>
-        <w:rPr>
-          <w:lang w:eastAsia="zh-CN"/>
-        </w:rPr>
-        <w:t xml:space="preserve"> backend/ (Node.js, </w:t>
-      </w:r>
-      <w:r>
-        <w:rPr>
-          <w:lang w:eastAsia="zh-CN"/>
-        </w:rPr>
-        <w:t>Postgr</w:t>
-      </w:r>
-      <w:r>
-        <w:rPr>
-          <w:lang w:eastAsia="zh-CN"/>
-        </w:rPr>
-        <w:t>e</w:t>
-      </w:r>
-      <w:r>
-        <w:rPr>
-          <w:lang w:eastAsia="zh-CN"/>
-        </w:rPr>
-        <w:t>SQL</w:t>
-      </w:r>
-      <w:r>
-        <w:rPr>
-          <w:lang w:eastAsia="zh-CN"/>
-        </w:rPr>
-        <w:t>)</w:t>
-      </w:r>
-    </w:p>
-    <w:p>
-      <w:pPr>
         <w:spacing w:line="360" w:lineRule="auto"/>
       </w:pPr>
     </w:p>
@@ -4380,7 +4042,46 @@
         <w:rPr>
           <w:lang w:eastAsia="zh-CN"/>
         </w:rPr>
-        <w:t xml:space="preserve">will have 2 interfaces. One for the youth and one for their parents or teacher that is tutoring their reading. </w:t>
+        <w:t>will</w:t>
+      </w:r>
+      <w:r>
+        <w:rPr>
+          <w:lang w:eastAsia="zh-CN"/>
+        </w:rPr>
+        <w:t xml:space="preserve"> have 2 interfaces. One for the youth and one for their parents or teacher that is tutoring their reading. </w:t>
+      </w:r>
+    </w:p>
+    <w:p>
+      <w:pPr>
+        <w:spacing w:line="360" w:lineRule="auto"/>
+        <w:rPr>
+          <w:lang w:eastAsia="zh-CN"/>
+        </w:rPr>
+      </w:pPr>
+      <w:r>
+        <w:rPr>
+          <w:lang w:eastAsia="zh-CN"/>
+        </w:rPr>
+        <w:t>Outside these interfaces</w:t>
+      </w:r>
+    </w:p>
+    <w:p>
+      <w:pPr>
+        <w:pStyle w:val="ListParagraph"/>
+        <w:numPr>
+          <w:ilvl w:val="0"/>
+          <w:numId w:val="20"/>
+        </w:numPr>
+        <w:spacing w:line="360" w:lineRule="auto"/>
+        <w:rPr>
+          <w:lang w:eastAsia="zh-CN"/>
+        </w:rPr>
+      </w:pPr>
+      <w:r>
+        <w:rPr>
+          <w:lang w:eastAsia="zh-CN"/>
+        </w:rPr>
+        <w:t>Login scene: User profile setup (Role choosing, age and avatar)</w:t>
       </w:r>
     </w:p>
     <w:p>
@@ -4446,25 +4147,16 @@
         </w:rPr>
       </w:pPr>
       <w:r>
-        <w:rPr>
-          <w:lang w:eastAsia="zh-CN"/>
-        </w:rPr>
-        <w:t xml:space="preserve">Login scene: </w:t>
-      </w:r>
-      <w:r>
-        <w:t>User profile setup (</w:t>
-      </w:r>
-      <w:r>
-        <w:t xml:space="preserve">Role choosing, </w:t>
-      </w:r>
-      <w:r>
-        <w:t>age</w:t>
-      </w:r>
-      <w:r>
-        <w:t xml:space="preserve"> and</w:t>
-      </w:r>
-      <w:r>
-        <w:t xml:space="preserve"> avatar)</w:t>
+        <w:t xml:space="preserve">Game map system: </w:t>
+      </w:r>
+      <w:r>
+        <w:t xml:space="preserve">Level-based map where each level </w:t>
+      </w:r>
+      <w:r>
+        <w:t>is</w:t>
+      </w:r>
+      <w:r>
+        <w:t xml:space="preserve"> one book</w:t>
       </w:r>
     </w:p>
     <w:p>
@@ -4480,16 +4172,25 @@
         </w:rPr>
       </w:pPr>
       <w:r>
-        <w:t xml:space="preserve">Game map system: </w:t>
-      </w:r>
-      <w:r>
-        <w:t xml:space="preserve">Level-based map where each level </w:t>
-      </w:r>
-      <w:r>
-        <w:t>is</w:t>
-      </w:r>
-      <w:r>
-        <w:t xml:space="preserve"> one book</w:t>
+        <w:rPr>
+          <w:lang w:eastAsia="zh-CN"/>
+        </w:rPr>
+        <w:t xml:space="preserve">Book reading Scene: </w:t>
+      </w:r>
+      <w:r>
+        <w:t xml:space="preserve">Shows </w:t>
+      </w:r>
+      <w:r>
+        <w:t xml:space="preserve">text and </w:t>
+      </w:r>
+      <w:r>
+        <w:t>illustrat</w:t>
+      </w:r>
+      <w:r>
+        <w:t>ion</w:t>
+      </w:r>
+      <w:r>
+        <w:t xml:space="preserve"> book pages</w:t>
       </w:r>
     </w:p>
     <w:p>
@@ -4508,22 +4209,13 @@
         <w:rPr>
           <w:lang w:eastAsia="zh-CN"/>
         </w:rPr>
-        <w:t xml:space="preserve">Book reading Scene: </w:t>
-      </w:r>
-      <w:r>
-        <w:t xml:space="preserve">Shows </w:t>
-      </w:r>
-      <w:r>
-        <w:t xml:space="preserve">text and </w:t>
-      </w:r>
-      <w:r>
-        <w:t>illustrat</w:t>
-      </w:r>
-      <w:r>
-        <w:t>ion</w:t>
-      </w:r>
-      <w:r>
-        <w:t xml:space="preserve"> book pages</w:t>
+        <w:t xml:space="preserve">Audio/Video player: </w:t>
+      </w:r>
+      <w:r>
+        <w:t>Plays narration for text</w:t>
+      </w:r>
+      <w:r>
+        <w:t xml:space="preserve"> and alt text for images</w:t>
       </w:r>
     </w:p>
     <w:p>
@@ -4542,13 +4234,13 @@
         <w:rPr>
           <w:lang w:eastAsia="zh-CN"/>
         </w:rPr>
-        <w:t xml:space="preserve">Audio/Video player: </w:t>
-      </w:r>
-      <w:r>
-        <w:t>Plays narration for text</w:t>
-      </w:r>
-      <w:r>
-        <w:t xml:space="preserve"> and alt text for images</w:t>
+        <w:t xml:space="preserve">Quiz scene: </w:t>
+      </w:r>
+      <w:r>
+        <w:rPr>
+          <w:lang w:eastAsia="zh-CN"/>
+        </w:rPr>
+        <w:t>Open questions</w:t>
       </w:r>
     </w:p>
     <w:p>
@@ -4567,13 +4259,16 @@
         <w:rPr>
           <w:lang w:eastAsia="zh-CN"/>
         </w:rPr>
-        <w:t xml:space="preserve">Quiz scene: </w:t>
-      </w:r>
-      <w:r>
-        <w:rPr>
-          <w:lang w:eastAsia="zh-CN"/>
-        </w:rPr>
-        <w:t>Open questions</w:t>
+        <w:t xml:space="preserve">Reward system </w:t>
+      </w:r>
+      <w:r>
+        <w:rPr>
+          <w:lang w:eastAsia="zh-CN"/>
+        </w:rPr>
+        <w:t xml:space="preserve">UI: </w:t>
+      </w:r>
+      <w:r>
+        <w:t>Shows badges/diploma</w:t>
       </w:r>
     </w:p>
     <w:p>
@@ -4592,58 +4287,30 @@
         <w:rPr>
           <w:lang w:eastAsia="zh-CN"/>
         </w:rPr>
-        <w:t xml:space="preserve">Reward system </w:t>
-      </w:r>
-      <w:r>
-        <w:rPr>
-          <w:lang w:eastAsia="zh-CN"/>
-        </w:rPr>
-        <w:t xml:space="preserve">UI: </w:t>
-      </w:r>
-      <w:r>
-        <w:t>Shows badges/diploma</w:t>
+        <w:t xml:space="preserve">Animation system: </w:t>
+      </w:r>
+      <w:r>
+        <w:t>Unlocking effects, reward animations</w:t>
       </w:r>
     </w:p>
     <w:p>
       <w:pPr>
         <w:pStyle w:val="ListParagraph"/>
-        <w:numPr>
-          <w:ilvl w:val="0"/>
-          <w:numId w:val="2"/>
-        </w:numPr>
-        <w:spacing w:line="360" w:lineRule="auto"/>
-        <w:rPr>
-          <w:lang w:eastAsia="zh-CN"/>
-        </w:rPr>
-      </w:pPr>
-      <w:r>
-        <w:rPr>
-          <w:lang w:eastAsia="zh-CN"/>
-        </w:rPr>
-        <w:t xml:space="preserve">Animation system: </w:t>
-      </w:r>
-      <w:r>
-        <w:t>Unlocking effects, reward animations</w:t>
-      </w:r>
-    </w:p>
-    <w:p>
-      <w:pPr>
-        <w:pStyle w:val="ListParagraph"/>
-        <w:spacing w:line="360" w:lineRule="auto"/>
-        <w:rPr>
-          <w:lang w:eastAsia="zh-CN"/>
-        </w:rPr>
-      </w:pPr>
-    </w:p>
-    <w:p>
-      <w:pPr>
-        <w:spacing w:line="360" w:lineRule="auto"/>
-      </w:pPr>
-      <w:r>
-        <w:rPr>
-          <w:lang w:eastAsia="zh-CN"/>
-        </w:rPr>
-        <w:t>Parents/Teacher interface may have the following main modules inside web interface:</w:t>
+        <w:spacing w:line="360" w:lineRule="auto"/>
+        <w:rPr>
+          <w:lang w:eastAsia="zh-CN"/>
+        </w:rPr>
+      </w:pPr>
+    </w:p>
+    <w:p>
+      <w:pPr>
+        <w:spacing w:line="360" w:lineRule="auto"/>
+      </w:pPr>
+      <w:r>
+        <w:rPr>
+          <w:lang w:eastAsia="zh-CN"/>
+        </w:rPr>
+        <w:t>Parent/Teacher interface may have the following main modules inside web interface:</w:t>
       </w:r>
     </w:p>
     <w:p>
@@ -4662,16 +4329,7 @@
         <w:rPr>
           <w:lang w:eastAsia="zh-CN"/>
         </w:rPr>
-        <w:t xml:space="preserve">Login scene: </w:t>
-      </w:r>
-      <w:r>
-        <w:t>User profile setup (Role choosing</w:t>
-      </w:r>
-      <w:r>
-        <w:t>, avatar</w:t>
-      </w:r>
-      <w:r>
-        <w:t>)</w:t>
+        <w:t>Progress supervision interface: View the kid’s reading progress</w:t>
       </w:r>
     </w:p>
     <w:p>
@@ -4690,7 +4348,7 @@
         <w:rPr>
           <w:lang w:eastAsia="zh-CN"/>
         </w:rPr>
-        <w:t>Progress supervision interface: View the kid’s reading progress</w:t>
+        <w:t>Quiz answers supervision: View the kid’s answers to the open quiz questions</w:t>
       </w:r>
     </w:p>
     <w:p>
@@ -4709,7 +4367,31 @@
         <w:rPr>
           <w:lang w:eastAsia="zh-CN"/>
         </w:rPr>
-        <w:t>Quiz answers supervision: View the kid’s answers to the open quiz questions</w:t>
+        <w:t>Book list managing: Manage what books there are in the reading map</w:t>
+      </w:r>
+    </w:p>
+    <w:p>
+      <w:pPr>
+        <w:pStyle w:val="Normal"/>
+        <w:spacing w:line="360" w:lineRule="auto"/>
+        <w:rPr>
+          <w:lang w:eastAsia="zh-CN"/>
+        </w:rPr>
+      </w:pPr>
+    </w:p>
+    <w:p>
+      <w:pPr>
+        <w:pStyle w:val="Normal"/>
+        <w:spacing w:line="360" w:lineRule="auto"/>
+        <w:rPr>
+          <w:lang w:eastAsia="zh-CN"/>
+        </w:rPr>
+      </w:pPr>
+      <w:r>
+        <w:rPr>
+          <w:lang w:eastAsia="zh-CN"/>
+        </w:rPr>
+        <w:t>Key differences between the Youth and Teacher interface:</w:t>
       </w:r>
     </w:p>
     <w:p>
@@ -4728,7 +4410,126 @@
         <w:rPr>
           <w:lang w:eastAsia="zh-CN"/>
         </w:rPr>
-        <w:t>Book list managing: Manage what books there are in the reading map</w:t>
+        <w:t>In Teacher’s interface, there would be admin controls where they can manage the book and students</w:t>
+      </w:r>
+    </w:p>
+    <w:p>
+      <w:pPr>
+        <w:pStyle w:val="ListParagraph"/>
+        <w:numPr>
+          <w:ilvl w:val="0"/>
+          <w:numId w:val="9"/>
+        </w:numPr>
+        <w:spacing w:line="360" w:lineRule="auto"/>
+        <w:rPr>
+          <w:lang w:eastAsia="zh-CN"/>
+        </w:rPr>
+      </w:pPr>
+      <w:r>
+        <w:rPr>
+          <w:lang w:eastAsia="zh-CN"/>
+        </w:rPr>
+        <w:t>Teacher’s</w:t>
+      </w:r>
+      <w:r>
+        <w:rPr>
+          <w:lang w:eastAsia="zh-CN"/>
+        </w:rPr>
+        <w:t xml:space="preserve"> interface has much less visual elements, so the managing would be easier</w:t>
+      </w:r>
+    </w:p>
+    <w:p>
+      <w:pPr>
+        <w:pStyle w:val="Normal"/>
+        <w:spacing w:line="360" w:lineRule="auto"/>
+        <w:ind w:left="0"/>
+        <w:rPr>
+          <w:lang w:eastAsia="zh-CN"/>
+        </w:rPr>
+      </w:pPr>
+    </w:p>
+    <w:p>
+      <w:pPr>
+        <w:pStyle w:val="Normal"/>
+        <w:spacing w:line="360" w:lineRule="auto"/>
+        <w:rPr>
+          <w:lang w:eastAsia="zh-CN"/>
+        </w:rPr>
+      </w:pPr>
+    </w:p>
+    <w:p>
+      <w:pPr>
+        <w:pStyle w:val="Normal"/>
+        <w:spacing w:line="360" w:lineRule="auto"/>
+        <w:rPr>
+          <w:lang w:eastAsia="zh-CN"/>
+        </w:rPr>
+      </w:pPr>
+      <w:r>
+        <w:rPr>
+          <w:lang w:eastAsia="zh-CN"/>
+        </w:rPr>
+        <w:t xml:space="preserve">If we want to make the progress supervision interface for teachers </w:t>
+      </w:r>
+      <w:r>
+        <w:rPr>
+          <w:lang w:eastAsia="zh-CN"/>
+        </w:rPr>
+        <w:t>really simple</w:t>
+      </w:r>
+      <w:r>
+        <w:rPr>
+          <w:lang w:eastAsia="zh-CN"/>
+        </w:rPr>
+        <w:t xml:space="preserve">, we could just show a list of students to choose </w:t>
+      </w:r>
+      <w:r>
+        <w:rPr>
+          <w:lang w:eastAsia="zh-CN"/>
+        </w:rPr>
+        <w:t>from, and</w:t>
+      </w:r>
+      <w:r>
+        <w:rPr>
+          <w:lang w:eastAsia="zh-CN"/>
+        </w:rPr>
+        <w:t xml:space="preserve"> show them </w:t>
+      </w:r>
+      <w:r>
+        <w:rPr>
+          <w:lang w:eastAsia="zh-CN"/>
+        </w:rPr>
+        <w:t xml:space="preserve">a dashboard that </w:t>
+      </w:r>
+      <w:r>
+        <w:rPr>
+          <w:lang w:eastAsia="zh-CN"/>
+        </w:rPr>
+        <w:t>opens up</w:t>
+      </w:r>
+      <w:r>
+        <w:rPr>
+          <w:lang w:eastAsia="zh-CN"/>
+        </w:rPr>
+        <w:t xml:space="preserve"> when choosing a student, that dashboard would show</w:t>
+      </w:r>
+      <w:r>
+        <w:rPr>
+          <w:lang w:eastAsia="zh-CN"/>
+        </w:rPr>
+        <w:t xml:space="preserve"> their progress for each level, the books</w:t>
+      </w:r>
+      <w:r>
+        <w:rPr>
+          <w:lang w:eastAsia="zh-CN"/>
+        </w:rPr>
+        <w:t xml:space="preserve"> read</w:t>
+      </w:r>
+      <w:r>
+        <w:rPr>
+          <w:lang w:eastAsia="zh-CN"/>
+        </w:rPr>
+        <w:t>, rewards, avatar etc.</w:t>
       </w:r>
     </w:p>
     <w:p>
@@ -4745,12 +4546,12 @@
         <w:pStyle w:val="Heading3"/>
         <w:rPr/>
       </w:pPr>
-      <w:bookmarkStart w:name="_Toc1326302207" w:id="681414440"/>
+      <w:bookmarkStart w:name="_Toc178799646" w:id="2043165137"/>
       <w:r>
         <w:rPr/>
         <w:t>Backend server</w:t>
       </w:r>
-      <w:bookmarkEnd w:id="681414440"/>
+      <w:bookmarkEnd w:id="2043165137"/>
     </w:p>
     <w:p>
       <w:pPr>
@@ -4834,18 +4635,19 @@
           <w:numId w:val="6"/>
         </w:numPr>
         <w:spacing w:line="360" w:lineRule="auto"/>
-      </w:pPr>
-      <w:r>
+        <w:rPr/>
+      </w:pPr>
+      <w:r>
+        <w:rPr/>
         <w:t>Reading</w:t>
       </w:r>
       <w:r>
+        <w:rPr/>
         <w:t xml:space="preserve"> checking: </w:t>
       </w:r>
       <w:r>
-        <w:t>Open questions</w:t>
-      </w:r>
-      <w:r>
-        <w:t xml:space="preserve"> (some questions could be asked when reading the book) </w:t>
+        <w:rPr/>
+        <w:t>Tracked via percentages.</w:t>
       </w:r>
     </w:p>
     <w:p>
@@ -4895,76 +4697,7 @@
     </w:p>
     <w:p>
       <w:pPr>
-        <w:spacing w:line="360" w:lineRule="auto"/>
-      </w:pPr>
-    </w:p>
-    <w:p>
-      <w:pPr>
-        <w:spacing w:line="360" w:lineRule="auto"/>
-      </w:pPr>
-    </w:p>
-    <w:p>
-      <w:pPr>
-        <w:spacing w:line="360" w:lineRule="auto"/>
-      </w:pPr>
-    </w:p>
-    <w:p>
-      <w:pPr>
-        <w:spacing w:line="360" w:lineRule="auto"/>
-      </w:pPr>
-    </w:p>
-    <w:p>
-      <w:pPr>
-        <w:spacing w:line="360" w:lineRule="auto"/>
-      </w:pPr>
-    </w:p>
-    <w:p>
-      <w:pPr>
-        <w:spacing w:line="360" w:lineRule="auto"/>
-      </w:pPr>
-    </w:p>
-    <w:p>
-      <w:pPr>
-        <w:spacing w:line="360" w:lineRule="auto"/>
-      </w:pPr>
-    </w:p>
-    <w:p>
-      <w:pPr>
-        <w:spacing w:line="360" w:lineRule="auto"/>
-      </w:pPr>
-    </w:p>
-    <w:p>
-      <w:pPr>
-        <w:spacing w:line="360" w:lineRule="auto"/>
-      </w:pPr>
-    </w:p>
-    <w:p>
-      <w:pPr>
-        <w:spacing w:line="360" w:lineRule="auto"/>
-      </w:pPr>
-    </w:p>
-    <w:p>
-      <w:pPr>
-        <w:spacing w:line="360" w:lineRule="auto"/>
-      </w:pPr>
-    </w:p>
-    <w:p>
-      <w:pPr>
-        <w:spacing w:line="360" w:lineRule="auto"/>
-      </w:pPr>
-    </w:p>
-    <w:p>
-      <w:pPr>
-        <w:spacing w:line="360" w:lineRule="auto"/>
-      </w:pPr>
-    </w:p>
-    <w:p>
-      <w:pPr>
-        <w:spacing w:line="360" w:lineRule="auto"/>
-      </w:pPr>
-    </w:p>
-    <w:p>
-      <w:pPr>
+        <w:pStyle w:val="Normal"/>
         <w:spacing w:line="360" w:lineRule="auto"/>
       </w:pPr>
     </w:p>
@@ -4973,25 +4706,52 @@
         <w:pStyle w:val="Heading3"/>
         <w:rPr/>
       </w:pPr>
-      <w:bookmarkStart w:name="_Toc1654132234" w:id="298688952"/>
+      <w:bookmarkStart w:name="_Toc1643055133" w:id="935583719"/>
       <w:r>
         <w:rPr/>
         <w:t>Database structure</w:t>
       </w:r>
-      <w:bookmarkEnd w:id="298688952"/>
-    </w:p>
-    <w:p/>
+      <w:bookmarkEnd w:id="935583719"/>
+    </w:p>
     <w:p>
       <w:pPr>
         <w:pStyle w:val="Normal"/>
         <w:spacing w:line="360" w:lineRule="auto"/>
-      </w:pPr>
+        <w:rPr>
+          <w:color w:val="auto"/>
+        </w:rPr>
+      </w:pPr>
+      <w:r>
+        <w:rPr>
+          <w:b w:val="1"/>
+          <w:bCs w:val="1"/>
+        </w:rPr>
+        <w:t>MVP</w:t>
+      </w:r>
+    </w:p>
+    <w:p>
+      <w:pPr>
+        <w:pStyle w:val="Normal"/>
+        <w:spacing w:line="360" w:lineRule="auto"/>
+        <w:rPr>
+          <w:color w:val="auto"/>
+          <w:lang w:eastAsia="zh-CN"/>
+        </w:rPr>
+      </w:pPr>
+      <w:r>
+        <w:rPr>
+          <w:b w:val="1"/>
+          <w:bCs w:val="1"/>
+          <w:color w:val="auto"/>
+        </w:rPr>
+        <w:t xml:space="preserve"> </w:t>
+      </w:r>
       <w:r>
         <w:drawing>
-          <wp:inline wp14:editId="6F9BCA2B" wp14:anchorId="53ED637E">
-            <wp:extent cx="5753920" cy="6296025"/>
+          <wp:inline wp14:editId="3DE0DA8B" wp14:anchorId="15CB01CC">
+            <wp:extent cx="5734050" cy="5619750"/>
             <wp:effectExtent l="0" t="0" r="0" b="0"/>
-            <wp:docPr id="1904883757" name="drawing"/>
+            <wp:docPr id="365083961" name="drawing"/>
             <wp:cNvGraphicFramePr>
               <a:graphicFrameLocks noChangeAspect="1"/>
             </wp:cNvGraphicFramePr>
@@ -4999,14 +4759,14 @@
               <a:graphicData xmlns:a="http://schemas.openxmlformats.org/drawingml/2006/main" uri="http://schemas.openxmlformats.org/drawingml/2006/picture">
                 <pic:pic xmlns:pic="http://schemas.openxmlformats.org/drawingml/2006/picture">
                   <pic:nvPicPr>
-                    <pic:cNvPr id="1904883757" name="Picture 1904883757"/>
+                    <pic:cNvPr id="365083961" name=""/>
                     <pic:cNvPicPr/>
                   </pic:nvPicPr>
                   <pic:blipFill>
-                    <a:blip xmlns:r="http://schemas.openxmlformats.org/officeDocument/2006/relationships" r:embed="rId1523678825">
+                    <a:blip xmlns:r="http://schemas.openxmlformats.org/officeDocument/2006/relationships" r:embed="rId1072341206">
                       <a:extLst>
-                        <a:ext uri="{28A0092B-C50C-407E-A947-70E740481C1C}">
-                          <a14:useLocalDpi xmlns:a14="http://schemas.microsoft.com/office/drawing/2010/main"/>
+                        <a:ext xmlns:a="http://schemas.openxmlformats.org/drawingml/2006/main" uri="{28A0092B-C50C-407E-A947-70E740481C1C}">
+                          <a14:useLocalDpi xmlns:a14="http://schemas.microsoft.com/office/drawing/2010/main" val="0"/>
                         </a:ext>
                       </a:extLst>
                     </a:blip>
@@ -5015,9 +4775,9 @@
                     </a:stretch>
                   </pic:blipFill>
                   <pic:spPr>
-                    <a:xfrm rot="0">
+                    <a:xfrm>
                       <a:off x="0" y="0"/>
-                      <a:ext cx="5753920" cy="6296025"/>
+                      <a:ext cx="5734050" cy="5619750"/>
                     </a:xfrm>
                     <a:prstGeom prst="rect">
                       <a:avLst/>
@@ -5032,163 +4792,42 @@
     </w:p>
     <w:p>
       <w:pPr>
-        <w:spacing w:line="360" w:lineRule="auto"/>
-      </w:pPr>
-    </w:p>
-    <w:p>
-      <w:pPr>
-        <w:pStyle w:val="Heading3"/>
-        <w:rPr/>
-      </w:pPr>
-      <w:bookmarkStart w:name="_Toc1325118075" w:id="588380921"/>
-      <w:r>
-        <w:rPr/>
-        <w:t>Data flow</w:t>
-      </w:r>
-      <w:bookmarkEnd w:id="588380921"/>
-    </w:p>
-    <w:p/>
-    <w:p>
-      <w:r>
-        <w:t xml:space="preserve">When </w:t>
-      </w:r>
-      <w:r>
-        <w:t xml:space="preserve">child finishes a </w:t>
-      </w:r>
-      <w:r>
-        <w:rPr>
-          <w:rFonts w:hint="eastAsia"/>
-          <w:lang w:eastAsia="zh-CN"/>
-        </w:rPr>
-        <w:t>book</w:t>
-      </w:r>
-      <w:r>
-        <w:t>:</w:t>
-      </w:r>
-    </w:p>
-    <w:p>
-      <w:pPr>
-        <w:pStyle w:val="ListParagraph"/>
-        <w:numPr>
-          <w:ilvl w:val="0"/>
-          <w:numId w:val="10"/>
-        </w:numPr>
-      </w:pPr>
-      <w:r>
-        <w:t>Show open questions</w:t>
-      </w:r>
-    </w:p>
-    <w:p>
-      <w:pPr>
-        <w:pStyle w:val="ListParagraph"/>
-        <w:numPr>
-          <w:ilvl w:val="0"/>
-          <w:numId w:val="10"/>
-        </w:numPr>
-      </w:pPr>
-      <w:r>
-        <w:t>Children answer questions</w:t>
-      </w:r>
-    </w:p>
-    <w:p>
-      <w:pPr>
-        <w:pStyle w:val="ListParagraph"/>
-        <w:numPr>
-          <w:ilvl w:val="1"/>
-          <w:numId w:val="10"/>
-        </w:numPr>
-      </w:pPr>
-      <w:r>
-        <w:rPr>
-          <w:rFonts w:hint="eastAsia"/>
-        </w:rPr>
-        <w:t>→</w:t>
-      </w:r>
-      <w:r>
-        <w:rPr>
-          <w:rFonts w:hint="eastAsia"/>
-        </w:rPr>
-        <w:t xml:space="preserve"> Save completion</w:t>
-      </w:r>
-    </w:p>
-    <w:p>
-      <w:pPr>
-        <w:pStyle w:val="ListParagraph"/>
-        <w:numPr>
-          <w:ilvl w:val="1"/>
-          <w:numId w:val="10"/>
-        </w:numPr>
-      </w:pPr>
-      <w:r>
-        <w:rPr>
-          <w:rFonts w:hint="eastAsia"/>
-        </w:rPr>
-        <w:t>→</w:t>
-      </w:r>
-      <w:r>
-        <w:rPr>
-          <w:rFonts w:hint="eastAsia"/>
-        </w:rPr>
-        <w:t xml:space="preserve"> Add </w:t>
-      </w:r>
-      <w:r>
-        <w:t>a badge</w:t>
-      </w:r>
-    </w:p>
-    <w:p>
-      <w:pPr>
-        <w:pStyle w:val="ListParagraph"/>
-        <w:numPr>
-          <w:ilvl w:val="1"/>
-          <w:numId w:val="10"/>
-        </w:numPr>
-      </w:pPr>
-      <w:r>
-        <w:rPr>
-          <w:rFonts w:hint="eastAsia"/>
-        </w:rPr>
-        <w:t>→</w:t>
-      </w:r>
-      <w:r>
-        <w:rPr>
-          <w:rFonts w:hint="eastAsia"/>
-        </w:rPr>
-        <w:t xml:space="preserve"> Unlock next level</w:t>
-      </w:r>
-    </w:p>
-    <w:p>
-      <w:pPr>
-        <w:pStyle w:val="ListParagraph"/>
-        <w:numPr>
-          <w:ilvl w:val="0"/>
-          <w:numId w:val="10"/>
-        </w:numPr>
-      </w:pPr>
-      <w:r>
-        <w:rPr>
-          <w:lang w:eastAsia="zh-CN"/>
-        </w:rPr>
-        <w:t xml:space="preserve">Show </w:t>
-      </w:r>
-      <w:r>
-        <w:t xml:space="preserve">reward animation </w:t>
-      </w:r>
-      <w:r>
-        <w:rPr>
-          <w:rFonts w:ascii="Apple Color Emoji" w:hAnsi="Apple Color Emoji" w:cs="Apple Color Emoji"/>
-        </w:rPr>
-        <w:t>🎉</w:t>
-      </w:r>
-    </w:p>
-    <w:p/>
-    <w:p>
-      <w:pPr/>
+        <w:pStyle w:val="Normal"/>
+        <w:spacing w:line="360" w:lineRule="auto"/>
+        <w:rPr>
+          <w:color w:val="auto"/>
+        </w:rPr>
+      </w:pPr>
+    </w:p>
+    <w:p>
+      <w:pPr>
+        <w:pStyle w:val="Normal"/>
+        <w:spacing w:line="360" w:lineRule="auto"/>
+        <w:rPr>
+          <w:color w:val="auto"/>
+        </w:rPr>
+      </w:pPr>
+      <w:r>
+        <w:rPr>
+          <w:color w:val="auto"/>
+        </w:rPr>
+        <w:t>MVP + future implementation ideas</w:t>
+      </w:r>
+    </w:p>
+    <w:p>
+      <w:pPr>
+        <w:pStyle w:val="Normal"/>
+        <w:spacing w:line="360" w:lineRule="auto"/>
+        <w:rPr>
+          <w:color w:val="auto"/>
+        </w:rPr>
+      </w:pPr>
       <w:r>
         <w:drawing>
-          <wp:inline wp14:editId="00E6EFFF" wp14:anchorId="0CC58317">
-            <wp:extent cx="6226357" cy="7334250"/>
+          <wp:inline wp14:editId="167769BE" wp14:anchorId="10417A60">
+            <wp:extent cx="6305550" cy="4743450"/>
             <wp:effectExtent l="0" t="0" r="0" b="0"/>
-            <wp:docPr id="983384463" name="drawing"/>
+            <wp:docPr id="816767137" name="drawing"/>
             <wp:cNvGraphicFramePr>
               <a:graphicFrameLocks noChangeAspect="1"/>
             </wp:cNvGraphicFramePr>
@@ -5196,14 +4835,14 @@
               <a:graphicData xmlns:a="http://schemas.openxmlformats.org/drawingml/2006/main" uri="http://schemas.openxmlformats.org/drawingml/2006/picture">
                 <pic:pic xmlns:pic="http://schemas.openxmlformats.org/drawingml/2006/picture">
                   <pic:nvPicPr>
-                    <pic:cNvPr id="983384463" name=""/>
+                    <pic:cNvPr id="816767137" name=""/>
                     <pic:cNvPicPr/>
                   </pic:nvPicPr>
                   <pic:blipFill>
-                    <a:blip xmlns:r="http://schemas.openxmlformats.org/officeDocument/2006/relationships" r:embed="rId1510772867">
+                    <a:blip xmlns:r="http://schemas.openxmlformats.org/officeDocument/2006/relationships" r:embed="rId12672269">
                       <a:extLst>
-                        <a:ext uri="{28A0092B-C50C-407E-A947-70E740481C1C}">
-                          <a14:useLocalDpi xmlns:a14="http://schemas.microsoft.com/office/drawing/2010/main"/>
+                        <a:ext xmlns:a="http://schemas.openxmlformats.org/drawingml/2006/main" uri="{28A0092B-C50C-407E-A947-70E740481C1C}">
+                          <a14:useLocalDpi xmlns:a14="http://schemas.microsoft.com/office/drawing/2010/main" val="0"/>
                         </a:ext>
                       </a:extLst>
                     </a:blip>
@@ -5212,9 +4851,9 @@
                     </a:stretch>
                   </pic:blipFill>
                   <pic:spPr>
-                    <a:xfrm rot="0">
+                    <a:xfrm>
                       <a:off x="0" y="0"/>
-                      <a:ext cx="6226357" cy="7334250"/>
+                      <a:ext cx="6305550" cy="4743450"/>
                     </a:xfrm>
                     <a:prstGeom prst="rect">
                       <a:avLst/>
@@ -5229,15 +4868,238 @@
     </w:p>
     <w:p>
       <w:pPr>
+        <w:pStyle w:val="Heading3"/>
+        <w:rPr/>
+      </w:pPr>
+      <w:bookmarkStart w:name="_Toc1887849652" w:id="1799246683"/>
+      <w:r>
+        <w:rPr/>
+        <w:t>Data flow</w:t>
+      </w:r>
+      <w:bookmarkEnd w:id="1799246683"/>
+    </w:p>
+    <w:p/>
+    <w:p>
+      <w:r>
+        <w:t xml:space="preserve">When </w:t>
+      </w:r>
+      <w:r>
+        <w:t xml:space="preserve">child finishes a </w:t>
+      </w:r>
+      <w:r>
+        <w:rPr>
+          <w:rFonts w:hint="eastAsia"/>
+          <w:lang w:eastAsia="zh-CN"/>
+        </w:rPr>
+        <w:t>book</w:t>
+      </w:r>
+      <w:r>
+        <w:t>:</w:t>
+      </w:r>
+    </w:p>
+    <w:p>
+      <w:pPr>
+        <w:pStyle w:val="ListParagraph"/>
+        <w:numPr>
+          <w:ilvl w:val="0"/>
+          <w:numId w:val="10"/>
+        </w:numPr>
+      </w:pPr>
+      <w:r>
+        <w:t>Show open questions</w:t>
+      </w:r>
+    </w:p>
+    <w:p>
+      <w:pPr>
+        <w:pStyle w:val="ListParagraph"/>
+        <w:numPr>
+          <w:ilvl w:val="0"/>
+          <w:numId w:val="10"/>
+        </w:numPr>
+      </w:pPr>
+      <w:r>
+        <w:t>Children answer questions</w:t>
+      </w:r>
+    </w:p>
+    <w:p>
+      <w:pPr>
+        <w:pStyle w:val="ListParagraph"/>
+        <w:numPr>
+          <w:ilvl w:val="1"/>
+          <w:numId w:val="10"/>
+        </w:numPr>
+      </w:pPr>
+      <w:r>
+        <w:rPr>
+          <w:rFonts w:hint="eastAsia"/>
+        </w:rPr>
+        <w:t>→</w:t>
+      </w:r>
+      <w:r>
+        <w:rPr>
+          <w:rFonts w:hint="eastAsia"/>
+        </w:rPr>
+        <w:t xml:space="preserve"> Save completion</w:t>
+      </w:r>
+    </w:p>
+    <w:p>
+      <w:pPr>
+        <w:pStyle w:val="ListParagraph"/>
+        <w:numPr>
+          <w:ilvl w:val="1"/>
+          <w:numId w:val="10"/>
+        </w:numPr>
+      </w:pPr>
+      <w:r>
+        <w:rPr>
+          <w:rFonts w:hint="eastAsia"/>
+        </w:rPr>
+        <w:t>→</w:t>
+      </w:r>
+      <w:r>
+        <w:rPr>
+          <w:rFonts w:hint="eastAsia"/>
+        </w:rPr>
+        <w:t xml:space="preserve"> Add </w:t>
+      </w:r>
+      <w:r>
+        <w:t>a badge</w:t>
+      </w:r>
+    </w:p>
+    <w:p>
+      <w:pPr>
+        <w:pStyle w:val="ListParagraph"/>
+        <w:numPr>
+          <w:ilvl w:val="1"/>
+          <w:numId w:val="10"/>
+        </w:numPr>
+      </w:pPr>
+      <w:r>
+        <w:rPr>
+          <w:rFonts w:hint="eastAsia"/>
+        </w:rPr>
+        <w:t>→</w:t>
+      </w:r>
+      <w:r>
+        <w:rPr>
+          <w:rFonts w:hint="eastAsia"/>
+        </w:rPr>
+        <w:t xml:space="preserve"> Unlock next level</w:t>
+      </w:r>
+    </w:p>
+    <w:p>
+      <w:pPr>
+        <w:pStyle w:val="ListParagraph"/>
+        <w:numPr>
+          <w:ilvl w:val="0"/>
+          <w:numId w:val="10"/>
+        </w:numPr>
+        <w:rPr/>
+      </w:pPr>
+      <w:r>
+        <w:rPr>
+          <w:lang w:eastAsia="zh-CN"/>
+        </w:rPr>
+        <w:t xml:space="preserve">Show </w:t>
+      </w:r>
+      <w:r>
+        <w:rPr/>
+        <w:t xml:space="preserve">reward animation </w:t>
+      </w:r>
+      <w:r>
+        <w:rPr>
+          <w:rFonts w:ascii="Apple Color Emoji" w:hAnsi="Apple Color Emoji" w:cs="Apple Color Emoji"/>
+        </w:rPr>
+        <w:t>🎉</w:t>
+      </w:r>
+    </w:p>
+    <w:p>
+      <w:pPr>
+        <w:pStyle w:val="Normal"/>
+        <w:spacing w:line="360" w:lineRule="auto"/>
+        <w:rPr>
+          <w:color w:val="auto"/>
+        </w:rPr>
+      </w:pPr>
+    </w:p>
+    <w:p>
+      <w:pPr>
+        <w:pStyle w:val="Normal"/>
+        <w:spacing w:line="360" w:lineRule="auto"/>
+        <w:rPr>
+          <w:color w:val="auto"/>
+        </w:rPr>
+      </w:pPr>
+      <w:r>
+        <w:rPr>
+          <w:color w:val="auto"/>
+        </w:rPr>
+        <w:t xml:space="preserve">Flow chart. </w:t>
+      </w:r>
+      <w:r>
+        <w:rPr>
+          <w:color w:val="auto"/>
+        </w:rPr>
+        <w:t>MVP + future implementation ideas</w:t>
+      </w:r>
+    </w:p>
+    <w:p>
+      <w:pPr/>
+      <w:r>
+        <w:drawing>
+          <wp:inline wp14:editId="7D05E13E" wp14:anchorId="4C975155">
+            <wp:extent cx="5467350" cy="6305550"/>
+            <wp:effectExtent l="0" t="0" r="0" b="0"/>
+            <wp:docPr id="1393473791" name="drawing"/>
+            <wp:cNvGraphicFramePr>
+              <a:graphicFrameLocks noChangeAspect="1"/>
+            </wp:cNvGraphicFramePr>
+            <a:graphic>
+              <a:graphicData xmlns:a="http://schemas.openxmlformats.org/drawingml/2006/main" uri="http://schemas.openxmlformats.org/drawingml/2006/picture">
+                <pic:pic xmlns:pic="http://schemas.openxmlformats.org/drawingml/2006/picture">
+                  <pic:nvPicPr>
+                    <pic:cNvPr id="1393473791" name=""/>
+                    <pic:cNvPicPr/>
+                  </pic:nvPicPr>
+                  <pic:blipFill>
+                    <a:blip xmlns:r="http://schemas.openxmlformats.org/officeDocument/2006/relationships" r:embed="rId735909390">
+                      <a:extLst>
+                        <a:ext xmlns:a="http://schemas.openxmlformats.org/drawingml/2006/main" uri="{28A0092B-C50C-407E-A947-70E740481C1C}">
+                          <a14:useLocalDpi xmlns:a14="http://schemas.microsoft.com/office/drawing/2010/main" val="0"/>
+                        </a:ext>
+                      </a:extLst>
+                    </a:blip>
+                    <a:stretch>
+                      <a:fillRect/>
+                    </a:stretch>
+                  </pic:blipFill>
+                  <pic:spPr>
+                    <a:xfrm>
+                      <a:off x="0" y="0"/>
+                      <a:ext cx="5467350" cy="6305550"/>
+                    </a:xfrm>
+                    <a:prstGeom prst="rect">
+                      <a:avLst/>
+                    </a:prstGeom>
+                  </pic:spPr>
+                </pic:pic>
+              </a:graphicData>
+            </a:graphic>
+          </wp:inline>
+        </w:drawing>
+      </w:r>
+    </w:p>
+    <w:p>
+      <w:pPr>
         <w:pStyle w:val="Heading2"/>
         <w:rPr/>
       </w:pPr>
-      <w:bookmarkStart w:name="_Toc1244249167" w:id="1488252771"/>
+      <w:bookmarkStart w:name="_Toc1743919577" w:id="1349065499"/>
       <w:r>
         <w:rPr/>
         <w:t>Functionalities</w:t>
       </w:r>
-      <w:bookmarkEnd w:id="1488252771"/>
+      <w:bookmarkEnd w:id="1349065499"/>
     </w:p>
     <w:p>
       <w:pPr>
@@ -5340,7 +5202,7 @@
           <w:lang w:val="fi-FI" w:eastAsia="zh-CN"/>
         </w:rPr>
       </w:pPr>
-      <w:bookmarkStart w:name="_Toc1760740853" w:id="156738419"/>
+      <w:bookmarkStart w:name="_Toc1069343186" w:id="160002509"/>
       <w:r>
         <w:rPr>
           <w:lang w:eastAsia="zh-CN"/>
@@ -5359,7 +5221,7 @@
         </w:rPr>
         <w:t>features</w:t>
       </w:r>
-      <w:bookmarkEnd w:id="156738419"/>
+      <w:bookmarkEnd w:id="160002509"/>
     </w:p>
     <w:p>
       <w:pPr>
@@ -5407,10 +5269,12 @@
         </w:rPr>
       </w:pPr>
       <w:r>
+        <w:rPr/>
         <w:t xml:space="preserve">User registration and profile: </w:t>
       </w:r>
       <w:r>
-        <w:t>Login, select age group and avatar</w:t>
+        <w:rPr/>
+        <w:t>Login, select avatar</w:t>
       </w:r>
     </w:p>
     <w:p>
@@ -5489,21 +5353,31 @@
         </w:rPr>
       </w:pPr>
       <w:r>
+        <w:rPr/>
         <w:t>Qu</w:t>
       </w:r>
       <w:r>
+        <w:rPr/>
         <w:t>iz</w:t>
       </w:r>
       <w:r>
-        <w:t xml:space="preserve"> system: </w:t>
-      </w:r>
-      <w:r>
+        <w:rPr/>
+        <w:t xml:space="preserve"> system</w:t>
+      </w:r>
+      <w:r>
+        <w:rPr/>
+        <w:t xml:space="preserve">: </w:t>
+      </w:r>
+      <w:r>
+        <w:rPr/>
         <w:t>O</w:t>
       </w:r>
       <w:r>
+        <w:rPr/>
         <w:t>pen questions</w:t>
       </w:r>
       <w:r>
+        <w:rPr/>
         <w:t xml:space="preserve"> after reading to check comprehension</w:t>
       </w:r>
     </w:p>
@@ -5569,14 +5443,14 @@
           <w:lang w:eastAsia="zh-CN"/>
         </w:rPr>
       </w:pPr>
-      <w:bookmarkStart w:name="_Toc333273573" w:id="864229202"/>
+      <w:bookmarkStart w:name="_Toc1613483436" w:id="2097463347"/>
       <w:r>
         <w:rPr>
           <w:lang w:eastAsia="zh-CN"/>
         </w:rPr>
         <w:t>User flows</w:t>
       </w:r>
-      <w:bookmarkEnd w:id="864229202"/>
+      <w:bookmarkEnd w:id="2097463347"/>
     </w:p>
     <w:p>
       <w:pPr>
@@ -5955,14 +5829,14 @@
           <w:lang w:eastAsia="zh-CN"/>
         </w:rPr>
       </w:pPr>
-      <w:bookmarkStart w:name="_Toc565982724" w:id="490788639"/>
+      <w:bookmarkStart w:name="_Toc604258318" w:id="733693447"/>
       <w:r>
         <w:rPr>
           <w:lang w:eastAsia="zh-CN"/>
         </w:rPr>
         <w:t>MVP-level functionalities</w:t>
       </w:r>
-      <w:bookmarkEnd w:id="490788639"/>
+      <w:bookmarkEnd w:id="733693447"/>
     </w:p>
     <w:p>
       <w:pPr>
@@ -6046,24 +5920,31 @@
         </w:rPr>
       </w:pPr>
       <w:r>
+        <w:rPr/>
         <w:t xml:space="preserve">Book </w:t>
       </w:r>
       <w:r>
+        <w:rPr/>
         <w:t>r</w:t>
       </w:r>
       <w:r>
+        <w:rPr/>
         <w:t>eading (</w:t>
       </w:r>
       <w:r>
+        <w:rPr/>
         <w:t>t</w:t>
       </w:r>
       <w:r>
+        <w:rPr/>
         <w:t xml:space="preserve">ext + </w:t>
       </w:r>
       <w:r>
+        <w:rPr/>
         <w:t>audio</w:t>
       </w:r>
       <w:r>
+        <w:rPr/>
         <w:t>)</w:t>
       </w:r>
     </w:p>
@@ -6080,10 +5961,32 @@
         </w:rPr>
       </w:pPr>
       <w:r>
-        <w:t>Open</w:t>
-      </w:r>
-      <w:r>
-        <w:t xml:space="preserve"> questions per book</w:t>
+        <w:rPr/>
+        <w:t xml:space="preserve">Reward </w:t>
+      </w:r>
+      <w:r>
+        <w:rPr/>
+        <w:t>s</w:t>
+      </w:r>
+      <w:r>
+        <w:rPr/>
+        <w:t xml:space="preserve">ystem </w:t>
+      </w:r>
+      <w:r>
+        <w:rPr/>
+        <w:t>(</w:t>
+      </w:r>
+      <w:r>
+        <w:rPr/>
+        <w:t>b</w:t>
+      </w:r>
+      <w:r>
+        <w:rPr/>
+        <w:t>adge)</w:t>
+      </w:r>
+      <w:r>
+        <w:rPr/>
+        <w:t>.</w:t>
       </w:r>
     </w:p>
     <w:p>
@@ -6099,22 +6002,7 @@
         </w:rPr>
       </w:pPr>
       <w:r>
-        <w:t xml:space="preserve">Reward </w:t>
-      </w:r>
-      <w:r>
-        <w:t>s</w:t>
-      </w:r>
-      <w:r>
-        <w:t xml:space="preserve">ystem </w:t>
-      </w:r>
-      <w:r>
-        <w:t>(</w:t>
-      </w:r>
-      <w:r>
-        <w:t>b</w:t>
-      </w:r>
-      <w:r>
-        <w:t>adge)</w:t>
+        <w:t>Progress tracking</w:t>
       </w:r>
     </w:p>
     <w:p>
@@ -6130,8 +6018,34 @@
         </w:rPr>
       </w:pPr>
       <w:r>
-        <w:t>Progress tracking</w:t>
-      </w:r>
+        <w:rPr/>
+        <w:t>Game map navigation</w:t>
+      </w:r>
+    </w:p>
+    <w:p>
+      <w:pPr>
+        <w:pStyle w:val="Normal"/>
+        <w:spacing w:line="360" w:lineRule="auto"/>
+        <w:rPr>
+          <w:lang w:eastAsia="zh-CN"/>
+        </w:rPr>
+      </w:pPr>
+    </w:p>
+    <w:p>
+      <w:pPr>
+        <w:pStyle w:val="Heading3"/>
+        <w:rPr>
+          <w:lang w:eastAsia="zh-CN"/>
+        </w:rPr>
+      </w:pPr>
+      <w:bookmarkStart w:name="_Toc170042382" w:id="1056627527"/>
+      <w:r>
+        <w:rPr>
+          <w:lang w:eastAsia="zh-CN"/>
+        </w:rPr>
+        <w:t>Optional/future functionalities</w:t>
+      </w:r>
+      <w:bookmarkEnd w:id="1056627527"/>
     </w:p>
     <w:p>
       <w:pPr>
@@ -6141,14 +6055,33 @@
           <w:numId w:val="12"/>
         </w:numPr>
         <w:spacing w:line="360" w:lineRule="auto"/>
-        <w:rPr>
-          <w:lang w:eastAsia="zh-CN"/>
-        </w:rPr>
-      </w:pPr>
-      <w:r>
         <w:rPr/>
-        <w:t>Game map navigation</w:t>
-      </w:r>
+      </w:pPr>
+      <w:r>
+        <w:rPr/>
+        <w:t xml:space="preserve">Reward system improvements. </w:t>
+      </w:r>
+      <w:r>
+        <w:rPr/>
+        <w:t>Maybe sticker</w:t>
+      </w:r>
+      <w:r>
+        <w:rPr/>
+        <w:t xml:space="preserve"> collection in the user profile.</w:t>
+      </w:r>
+    </w:p>
+    <w:p>
+      <w:pPr>
+        <w:pStyle w:val="ListParagraph"/>
+        <w:numPr>
+          <w:ilvl w:val="0"/>
+          <w:numId w:val="12"/>
+        </w:numPr>
+        <w:spacing w:line="360" w:lineRule="auto"/>
+        <w:rPr>
+          <w:lang w:eastAsia="zh-CN"/>
+        </w:rPr>
+      </w:pPr>
     </w:p>
     <w:p>
       <w:pPr>
@@ -6162,112 +6095,48 @@
     <w:p>
       <w:pPr>
         <w:pStyle w:val="Heading1"/>
-        <w:suppressLineNumbers w:val="0"/>
-        <w:bidi w:val="0"/>
-        <w:spacing w:before="0" w:beforeAutospacing="off" w:after="800" w:afterAutospacing="off" w:line="360" w:lineRule="auto"/>
-        <w:ind w:left="181" w:right="0" w:hanging="181"/>
-        <w:jc w:val="left"/>
-        <w:rPr>
-          <w:lang w:eastAsia="zh-CN"/>
-        </w:rPr>
-      </w:pPr>
-      <w:bookmarkStart w:name="_Toc445770573" w:id="1456686754"/>
-      <w:r>
-        <w:rPr>
-          <w:lang w:eastAsia="zh-CN"/>
-        </w:rPr>
-        <w:t>Testing</w:t>
-      </w:r>
-      <w:r>
-        <w:rPr>
-          <w:lang w:eastAsia="zh-CN"/>
-        </w:rPr>
-        <w:t xml:space="preserve"> / Quality assurance</w:t>
-      </w:r>
-      <w:bookmarkEnd w:id="1456686754"/>
-    </w:p>
-    <w:p>
-      <w:pPr>
-        <w:pStyle w:val="Normal"/>
-        <w:bidi w:val="0"/>
-      </w:pPr>
-      <w:r>
-        <w:rPr/>
-        <w:t>Should we create test cases for different modules?</w:t>
-      </w:r>
+        <w:rPr>
+          <w:lang w:val="fi-FI" w:eastAsia="zh-CN"/>
+        </w:rPr>
+      </w:pPr>
+      <w:bookmarkStart w:name="_Toc1454625724" w:id="569628173"/>
+      <w:r>
+        <w:rPr>
+          <w:lang w:eastAsia="zh-CN"/>
+        </w:rPr>
+        <w:t>Pr</w:t>
+      </w:r>
+      <w:r>
+        <w:rPr>
+          <w:lang w:val="fi-FI" w:eastAsia="zh-CN"/>
+        </w:rPr>
+        <w:t>ogress</w:t>
+      </w:r>
+      <w:r>
+        <w:rPr>
+          <w:lang w:val="fi-FI" w:eastAsia="zh-CN"/>
+        </w:rPr>
+        <w:t xml:space="preserve"> </w:t>
+      </w:r>
+      <w:r>
+        <w:rPr>
+          <w:lang w:val="fi-FI" w:eastAsia="zh-CN"/>
+        </w:rPr>
+        <w:t>control</w:t>
+      </w:r>
+      <w:bookmarkEnd w:id="569628173"/>
     </w:p>
     <w:p>
       <w:pPr>
         <w:pStyle w:val="Heading2"/>
         <w:rPr/>
       </w:pPr>
-      <w:bookmarkStart w:name="_Toc367261876" w:id="1000499697"/>
-      <w:r>
-        <w:rPr/>
-        <w:t>Test cases</w:t>
-      </w:r>
-      <w:bookmarkEnd w:id="1000499697"/>
-    </w:p>
-    <w:p>
-      <w:pPr>
-        <w:pStyle w:val="Normal"/>
-        <w:bidi w:val="0"/>
-      </w:pPr>
-    </w:p>
-    <w:p>
-      <w:pPr>
-        <w:pStyle w:val="Normal"/>
-        <w:spacing w:line="360" w:lineRule="auto"/>
-        <w:rPr>
-          <w:lang w:eastAsia="zh-CN"/>
-        </w:rPr>
-      </w:pPr>
-    </w:p>
-    <w:p>
-      <w:pPr>
-        <w:pStyle w:val="Heading1"/>
-        <w:rPr>
-          <w:lang w:val="fi-FI" w:eastAsia="zh-CN"/>
-        </w:rPr>
-      </w:pPr>
-      <w:bookmarkStart w:name="_Toc83735894" w:id="487961157"/>
-      <w:r>
-        <w:rPr>
-          <w:lang w:eastAsia="zh-CN"/>
-        </w:rPr>
-        <w:t>Pr</w:t>
-      </w:r>
-      <w:r>
-        <w:rPr>
-          <w:lang w:val="fi-FI" w:eastAsia="zh-CN"/>
-        </w:rPr>
-        <w:t>ogress</w:t>
-      </w:r>
-      <w:r>
-        <w:rPr>
-          <w:lang w:val="fi-FI" w:eastAsia="zh-CN"/>
-        </w:rPr>
-        <w:t xml:space="preserve"> </w:t>
-      </w:r>
-      <w:r>
-        <w:rPr>
-          <w:lang w:val="fi-FI" w:eastAsia="zh-CN"/>
-        </w:rPr>
-        <w:t>control</w:t>
-      </w:r>
-      <w:bookmarkEnd w:id="487961157"/>
-    </w:p>
-    <w:p>
-      <w:pPr>
-        <w:pStyle w:val="Heading2"/>
-        <w:rPr/>
-      </w:pPr>
-      <w:bookmarkStart w:name="_Toc585484150" w:id="1044642723"/>
+      <w:bookmarkStart w:name="_Toc219906693" w:id="1391500048"/>
       <w:r>
         <w:rPr/>
         <w:t>Resourcing</w:t>
       </w:r>
-      <w:bookmarkEnd w:id="1044642723"/>
+      <w:bookmarkEnd w:id="1391500048"/>
     </w:p>
     <w:p/>
     <w:p>
@@ -7701,13 +7570,95 @@
         <w:pStyle w:val="Heading2"/>
         <w:rPr/>
       </w:pPr>
-      <w:bookmarkStart w:name="_Toc610773105" w:id="710559329"/>
+      <w:bookmarkStart w:name="_Toc1836357937" w:id="450348545"/>
       <w:r>
         <w:rPr/>
         <w:t>Preliminary schedule</w:t>
       </w:r>
-      <w:bookmarkEnd w:id="710559329"/>
-    </w:p>
+      <w:bookmarkEnd w:id="450348545"/>
+    </w:p>
+    <w:p>
+      <w:pPr>
+        <w:pStyle w:val="Normal"/>
+      </w:pPr>
+    </w:p>
+    <w:p>
+      <w:r>
+        <w:rPr/>
+        <w:t xml:space="preserve">All backend requests </w:t>
+      </w:r>
+      <w:r>
+        <w:rPr/>
+        <w:t>working</w:t>
+      </w:r>
+      <w:r>
+        <w:rPr/>
+        <w:t>: 1</w:t>
+      </w:r>
+      <w:r>
+        <w:rPr/>
+        <w:t>0</w:t>
+      </w:r>
+      <w:r>
+        <w:rPr/>
+        <w:t>.3.2026?</w:t>
+      </w:r>
+    </w:p>
+    <w:p>
+      <w:r>
+        <w:rPr/>
+        <w:t xml:space="preserve">Proper error handling for all requests: </w:t>
+      </w:r>
+      <w:r>
+        <w:rPr/>
+        <w:t>17</w:t>
+      </w:r>
+      <w:r>
+        <w:rPr/>
+        <w:t>.3.2026?</w:t>
+      </w:r>
+    </w:p>
+    <w:p>
+      <w:pPr>
+        <w:pStyle w:val="Normal"/>
+        <w:suppressLineNumbers w:val="0"/>
+        <w:bidi w:val="0"/>
+        <w:spacing w:before="0" w:beforeAutospacing="off" w:after="0" w:afterAutospacing="off" w:line="259" w:lineRule="auto"/>
+        <w:ind w:left="0" w:right="0"/>
+        <w:jc w:val="left"/>
+      </w:pPr>
+      <w:r>
+        <w:rPr/>
+        <w:t>Tests</w:t>
+      </w:r>
+      <w:r>
+        <w:rPr/>
+        <w:t xml:space="preserve"> (time until the presentation)</w:t>
+      </w:r>
+      <w:r>
+        <w:rPr/>
+        <w:t>: 9.4.2026?</w:t>
+      </w:r>
+    </w:p>
+    <w:p>
+      <w:r>
+        <w:rPr/>
+        <w:t>Frontend template/framework</w:t>
+      </w:r>
+      <w:r>
+        <w:rPr/>
+        <w:t xml:space="preserve"> (not all functionalities, but all necessary pages are displayed)</w:t>
+      </w:r>
+      <w:r>
+        <w:rPr/>
+        <w:t xml:space="preserve">: </w:t>
+      </w:r>
+      <w:r>
+        <w:rPr/>
+        <w:t>10.3.2026</w:t>
+      </w:r>
+    </w:p>
+    <w:p/>
     <w:p/>
     <w:p>
       <w:pPr>
@@ -7832,12 +7783,12 @@
         <w:pStyle w:val="Heading2"/>
         <w:rPr/>
       </w:pPr>
-      <w:bookmarkStart w:name="_Toc1858705858" w:id="2083871345"/>
+      <w:bookmarkStart w:name="_Toc575538698" w:id="2008213732"/>
       <w:r>
         <w:rPr/>
         <w:t>Project monitoring</w:t>
       </w:r>
-      <w:bookmarkEnd w:id="2083871345"/>
+      <w:bookmarkEnd w:id="2008213732"/>
     </w:p>
     <w:p/>
     <w:p>
@@ -8323,11 +8274,6 @@
     <w:p/>
     <w:p/>
     <w:p/>
-    <w:p>
-      <w:pPr>
-        <w:spacing w:line="360" w:lineRule="auto"/>
-      </w:pPr>
-    </w:p>
     <w:p>
       <w:pPr>
         <w:spacing w:line="360" w:lineRule="auto"/>
@@ -8390,6 +8336,14 @@
 </w:document>
 </file>
 
+<file path=word/commentsExtended.xml><?xml version="1.0" encoding="utf-8"?>
+<w15:commentsEx xmlns:mc="http://schemas.openxmlformats.org/markup-compatibility/2006" xmlns:w15="http://schemas.microsoft.com/office/word/2012/wordml" mc:Ignorable="w15"/>
+</file>
+
+<file path=word/commentsIds.xml><?xml version="1.0" encoding="utf-8"?>
+<w16cid:commentsIds xmlns:mc="http://schemas.openxmlformats.org/markup-compatibility/2006" xmlns:w16cid="http://schemas.microsoft.com/office/word/2016/wordml/cid" mc:Ignorable="w16cid"/>
+</file>
+
 <file path=word/endnotes.xml><?xml version="1.0" encoding="utf-8"?>
 <w:endnotes xmlns:wpc="http://schemas.microsoft.com/office/word/2010/wordprocessingCanvas" xmlns:cx="http://schemas.microsoft.com/office/drawing/2014/chartex" xmlns:cx1="http://schemas.microsoft.com/office/drawing/2015/9/8/chartex" xmlns:cx2="http://schemas.microsoft.com/office/drawing/2015/10/21/chartex" xmlns:cx3="http://schemas.microsoft.com/office/drawing/2016/5/9/chartex" xmlns:cx4="http://schemas.microsoft.com/office/drawing/2016/5/10/chartex" xmlns:cx5="http://schemas.microsoft.com/office/drawing/2016/5/11/chartex" xmlns:cx6="http://schemas.microsoft.com/office/drawing/2016/5/12/chartex" xmlns:cx7="http://schemas.microsoft.com/office/drawing/2016/5/13/chartex" xmlns:cx8="http://schemas.microsoft.com/office/drawing/2016/5/14/chartex" xmlns:mc="http://schemas.openxmlformats.org/markup-compatibility/2006" xmlns:aink="http://schemas.microsoft.com/office/drawing/2016/ink" xmlns:am3d="http://schemas.microsoft.com/office/drawing/2017/model3d" xmlns:o="urn:schemas-microsoft-com:office:office" xmlns:oel="http://schemas.microsoft.com/office/2019/extlst" xmlns:r="http://schemas.openxmlformats.org/officeDocument/2006/relationships" xmlns:m="http://schemas.openxmlformats.org/officeDocument/2006/math" xmlns:v="urn:schemas-microsoft-com:vml" xmlns:wp14="http://schemas.microsoft.com/office/word/2010/wordprocessingDrawing" xmlns:wp="http://schemas.openxmlformats.org/drawingml/2006/wordprocessingDrawing" xmlns:w10="urn:schemas-microsoft-com:office:word" xmlns:w="http://schemas.openxmlformats.org/wordprocessingml/2006/main" xmlns:w14="http://schemas.microsoft.com/office/word/2010/wordml" xmlns:w15="http://schemas.microsoft.com/office/word/2012/wordml" xmlns:w16cex="http://schemas.microsoft.com/office/word/2018/wordml/cex" xmlns:w16cid="http://schemas.microsoft.com/office/word/2016/wordml/cid" xmlns:w16="http://schemas.microsoft.com/office/word/2018/wordml" xmlns:w16du="http://schemas.microsoft.com/office/word/2023/wordml/word16du" xmlns:w16sdtdh="http://schemas.microsoft.com/office/word/2020/wordml/sdtdatahash" xmlns:w16sdtfl="http://schemas.microsoft.com/office/word/2024/wordml/sdtformatlock" xmlns:w16se="http://schemas.microsoft.com/office/word/2015/wordml/symex" xmlns:wpg="http://schemas.microsoft.com/office/word/2010/wordprocessingGroup" xmlns:wpi="http://schemas.microsoft.com/office/word/2010/wordprocessingInk" xmlns:wne="http://schemas.microsoft.com/office/word/2006/wordml" xmlns:wps="http://schemas.microsoft.com/office/word/2010/wordprocessingShape" mc:Ignorable="w14 w15 w16se w16cid w16 w16cex w16sdtdh w16sdtfl w16du wp14">
   <w:endnote w:type="separator" w:id="-1">
@@ -8474,6 +8428,512 @@
 
 <file path=word/numbering.xml><?xml version="1.0" encoding="utf-8"?>
 <w:numbering xmlns:wpc="http://schemas.microsoft.com/office/word/2010/wordprocessingCanvas" xmlns:cx="http://schemas.microsoft.com/office/drawing/2014/chartex" xmlns:cx1="http://schemas.microsoft.com/office/drawing/2015/9/8/chartex" xmlns:cx2="http://schemas.microsoft.com/office/drawing/2015/10/21/chartex" xmlns:cx3="http://schemas.microsoft.com/office/drawing/2016/5/9/chartex" xmlns:cx4="http://schemas.microsoft.com/office/drawing/2016/5/10/chartex" xmlns:cx5="http://schemas.microsoft.com/office/drawing/2016/5/11/chartex" xmlns:cx6="http://schemas.microsoft.com/office/drawing/2016/5/12/chartex" xmlns:cx7="http://schemas.microsoft.com/office/drawing/2016/5/13/chartex" xmlns:cx8="http://schemas.microsoft.com/office/drawing/2016/5/14/chartex" xmlns:mc="http://schemas.openxmlformats.org/markup-compatibility/2006" xmlns:aink="http://schemas.microsoft.com/office/drawing/2016/ink" xmlns:am3d="http://schemas.microsoft.com/office/drawing/2017/model3d" xmlns:o="urn:schemas-microsoft-com:office:office" xmlns:oel="http://schemas.microsoft.com/office/2019/extlst" xmlns:r="http://schemas.openxmlformats.org/officeDocument/2006/relationships" xmlns:m="http://schemas.openxmlformats.org/officeDocument/2006/math" xmlns:v="urn:schemas-microsoft-com:vml" xmlns:wp14="http://schemas.microsoft.com/office/word/2010/wordprocessingDrawing" xmlns:wp="http://schemas.openxmlformats.org/drawingml/2006/wordprocessingDrawing" xmlns:w10="urn:schemas-microsoft-com:office:word" xmlns:w="http://schemas.openxmlformats.org/wordprocessingml/2006/main" xmlns:w14="http://schemas.microsoft.com/office/word/2010/wordml" xmlns:w15="http://schemas.microsoft.com/office/word/2012/wordml" xmlns:w16cex="http://schemas.microsoft.com/office/word/2018/wordml/cex" xmlns:w16cid="http://schemas.microsoft.com/office/word/2016/wordml/cid" xmlns:w16="http://schemas.microsoft.com/office/word/2018/wordml" xmlns:w16du="http://schemas.microsoft.com/office/word/2023/wordml/word16du" xmlns:w16sdtdh="http://schemas.microsoft.com/office/word/2020/wordml/sdtdatahash" xmlns:w16sdtfl="http://schemas.microsoft.com/office/word/2024/wordml/sdtformatlock" xmlns:w16se="http://schemas.microsoft.com/office/word/2015/wordml/symex" xmlns:wpg="http://schemas.microsoft.com/office/word/2010/wordprocessingGroup" xmlns:wpi="http://schemas.microsoft.com/office/word/2010/wordprocessingInk" xmlns:wne="http://schemas.microsoft.com/office/word/2006/wordml" xmlns:wps="http://schemas.microsoft.com/office/word/2010/wordprocessingShape" mc:Ignorable="w14 w15 w16se w16cid w16 w16cex w16sdtdh w16sdtfl w16du wp14">
+  <w:abstractNum xmlns:w="http://schemas.openxmlformats.org/wordprocessingml/2006/main" w:abstractNumId="19">
+    <w:nsid w:val="25a13012"/>
+    <w:multiLevelType xmlns:w="http://schemas.openxmlformats.org/wordprocessingml/2006/main" w:val="hybridMultilevel"/>
+    <w:lvl xmlns:w="http://schemas.openxmlformats.org/wordprocessingml/2006/main" w:ilvl="0">
+      <w:start w:val="1"/>
+      <w:numFmt w:val="bullet"/>
+      <w:lvlText w:val="-"/>
+      <w:lvlJc w:val="left"/>
+      <w:pPr>
+        <w:ind w:left="720" w:hanging="360"/>
+      </w:pPr>
+      <w:rPr>
+        <w:rFonts w:hint="default" w:ascii="Aptos" w:hAnsi="Aptos"/>
+      </w:rPr>
+    </w:lvl>
+    <w:lvl xmlns:w="http://schemas.openxmlformats.org/wordprocessingml/2006/main" w:ilvl="1">
+      <w:start w:val="1"/>
+      <w:numFmt w:val="bullet"/>
+      <w:lvlText w:val="o"/>
+      <w:lvlJc w:val="left"/>
+      <w:pPr>
+        <w:ind w:left="1440" w:hanging="360"/>
+      </w:pPr>
+      <w:rPr>
+        <w:rFonts w:hint="default" w:ascii="Courier New" w:hAnsi="Courier New"/>
+      </w:rPr>
+    </w:lvl>
+    <w:lvl xmlns:w="http://schemas.openxmlformats.org/wordprocessingml/2006/main" w:ilvl="2">
+      <w:start w:val="1"/>
+      <w:numFmt w:val="bullet"/>
+      <w:lvlText w:val=""/>
+      <w:lvlJc w:val="left"/>
+      <w:pPr>
+        <w:ind w:left="2160" w:hanging="360"/>
+      </w:pPr>
+      <w:rPr>
+        <w:rFonts w:hint="default" w:ascii="Wingdings" w:hAnsi="Wingdings"/>
+      </w:rPr>
+    </w:lvl>
+    <w:lvl xmlns:w="http://schemas.openxmlformats.org/wordprocessingml/2006/main" w:ilvl="3">
+      <w:start w:val="1"/>
+      <w:numFmt w:val="bullet"/>
+      <w:lvlText w:val=""/>
+      <w:lvlJc w:val="left"/>
+      <w:pPr>
+        <w:ind w:left="2880" w:hanging="360"/>
+      </w:pPr>
+      <w:rPr>
+        <w:rFonts w:hint="default" w:ascii="Symbol" w:hAnsi="Symbol"/>
+      </w:rPr>
+    </w:lvl>
+    <w:lvl xmlns:w="http://schemas.openxmlformats.org/wordprocessingml/2006/main" w:ilvl="4">
+      <w:start w:val="1"/>
+      <w:numFmt w:val="bullet"/>
+      <w:lvlText w:val="o"/>
+      <w:lvlJc w:val="left"/>
+      <w:pPr>
+        <w:ind w:left="3600" w:hanging="360"/>
+      </w:pPr>
+      <w:rPr>
+        <w:rFonts w:hint="default" w:ascii="Courier New" w:hAnsi="Courier New"/>
+      </w:rPr>
+    </w:lvl>
+    <w:lvl xmlns:w="http://schemas.openxmlformats.org/wordprocessingml/2006/main" w:ilvl="5">
+      <w:start w:val="1"/>
+      <w:numFmt w:val="bullet"/>
+      <w:lvlText w:val=""/>
+      <w:lvlJc w:val="left"/>
+      <w:pPr>
+        <w:ind w:left="4320" w:hanging="360"/>
+      </w:pPr>
+      <w:rPr>
+        <w:rFonts w:hint="default" w:ascii="Wingdings" w:hAnsi="Wingdings"/>
+      </w:rPr>
+    </w:lvl>
+    <w:lvl xmlns:w="http://schemas.openxmlformats.org/wordprocessingml/2006/main" w:ilvl="6">
+      <w:start w:val="1"/>
+      <w:numFmt w:val="bullet"/>
+      <w:lvlText w:val=""/>
+      <w:lvlJc w:val="left"/>
+      <w:pPr>
+        <w:ind w:left="5040" w:hanging="360"/>
+      </w:pPr>
+      <w:rPr>
+        <w:rFonts w:hint="default" w:ascii="Symbol" w:hAnsi="Symbol"/>
+      </w:rPr>
+    </w:lvl>
+    <w:lvl xmlns:w="http://schemas.openxmlformats.org/wordprocessingml/2006/main" w:ilvl="7">
+      <w:start w:val="1"/>
+      <w:numFmt w:val="bullet"/>
+      <w:lvlText w:val="o"/>
+      <w:lvlJc w:val="left"/>
+      <w:pPr>
+        <w:ind w:left="5760" w:hanging="360"/>
+      </w:pPr>
+      <w:rPr>
+        <w:rFonts w:hint="default" w:ascii="Courier New" w:hAnsi="Courier New"/>
+      </w:rPr>
+    </w:lvl>
+    <w:lvl xmlns:w="http://schemas.openxmlformats.org/wordprocessingml/2006/main" w:ilvl="8">
+      <w:start w:val="1"/>
+      <w:numFmt w:val="bullet"/>
+      <w:lvlText w:val=""/>
+      <w:lvlJc w:val="left"/>
+      <w:pPr>
+        <w:ind w:left="6480" w:hanging="360"/>
+      </w:pPr>
+      <w:rPr>
+        <w:rFonts w:hint="default" w:ascii="Wingdings" w:hAnsi="Wingdings"/>
+      </w:rPr>
+    </w:lvl>
+  </w:abstractNum>
+  <w:abstractNum xmlns:w="http://schemas.openxmlformats.org/wordprocessingml/2006/main" w:abstractNumId="18">
+    <w:nsid w:val="1a7634dd"/>
+    <w:multiLevelType xmlns:w="http://schemas.openxmlformats.org/wordprocessingml/2006/main" w:val="hybridMultilevel"/>
+    <w:lvl xmlns:w="http://schemas.openxmlformats.org/wordprocessingml/2006/main" w:ilvl="0">
+      <w:start w:val="1"/>
+      <w:numFmt w:val="bullet"/>
+      <w:lvlText w:val=""/>
+      <w:lvlJc w:val="left"/>
+      <w:pPr>
+        <w:ind w:left="720" w:hanging="360"/>
+      </w:pPr>
+      <w:rPr>
+        <w:rFonts w:hint="default" w:ascii="Symbol" w:hAnsi="Symbol"/>
+      </w:rPr>
+    </w:lvl>
+    <w:lvl xmlns:w="http://schemas.openxmlformats.org/wordprocessingml/2006/main" w:ilvl="1">
+      <w:start w:val="1"/>
+      <w:numFmt w:val="bullet"/>
+      <w:lvlText w:val="o"/>
+      <w:lvlJc w:val="left"/>
+      <w:pPr>
+        <w:ind w:left="1440" w:hanging="360"/>
+      </w:pPr>
+      <w:rPr>
+        <w:rFonts w:hint="default" w:ascii="Courier New" w:hAnsi="Courier New"/>
+      </w:rPr>
+    </w:lvl>
+    <w:lvl xmlns:w="http://schemas.openxmlformats.org/wordprocessingml/2006/main" w:ilvl="2">
+      <w:start w:val="1"/>
+      <w:numFmt w:val="bullet"/>
+      <w:lvlText w:val=""/>
+      <w:lvlJc w:val="left"/>
+      <w:pPr>
+        <w:ind w:left="2160" w:hanging="360"/>
+      </w:pPr>
+      <w:rPr>
+        <w:rFonts w:hint="default" w:ascii="Wingdings" w:hAnsi="Wingdings"/>
+      </w:rPr>
+    </w:lvl>
+    <w:lvl xmlns:w="http://schemas.openxmlformats.org/wordprocessingml/2006/main" w:ilvl="3">
+      <w:start w:val="1"/>
+      <w:numFmt w:val="bullet"/>
+      <w:lvlText w:val=""/>
+      <w:lvlJc w:val="left"/>
+      <w:pPr>
+        <w:ind w:left="2880" w:hanging="360"/>
+      </w:pPr>
+      <w:rPr>
+        <w:rFonts w:hint="default" w:ascii="Symbol" w:hAnsi="Symbol"/>
+      </w:rPr>
+    </w:lvl>
+    <w:lvl xmlns:w="http://schemas.openxmlformats.org/wordprocessingml/2006/main" w:ilvl="4">
+      <w:start w:val="1"/>
+      <w:numFmt w:val="bullet"/>
+      <w:lvlText w:val="o"/>
+      <w:lvlJc w:val="left"/>
+      <w:pPr>
+        <w:ind w:left="3600" w:hanging="360"/>
+      </w:pPr>
+      <w:rPr>
+        <w:rFonts w:hint="default" w:ascii="Courier New" w:hAnsi="Courier New"/>
+      </w:rPr>
+    </w:lvl>
+    <w:lvl xmlns:w="http://schemas.openxmlformats.org/wordprocessingml/2006/main" w:ilvl="5">
+      <w:start w:val="1"/>
+      <w:numFmt w:val="bullet"/>
+      <w:lvlText w:val=""/>
+      <w:lvlJc w:val="left"/>
+      <w:pPr>
+        <w:ind w:left="4320" w:hanging="360"/>
+      </w:pPr>
+      <w:rPr>
+        <w:rFonts w:hint="default" w:ascii="Wingdings" w:hAnsi="Wingdings"/>
+      </w:rPr>
+    </w:lvl>
+    <w:lvl xmlns:w="http://schemas.openxmlformats.org/wordprocessingml/2006/main" w:ilvl="6">
+      <w:start w:val="1"/>
+      <w:numFmt w:val="bullet"/>
+      <w:lvlText w:val=""/>
+      <w:lvlJc w:val="left"/>
+      <w:pPr>
+        <w:ind w:left="5040" w:hanging="360"/>
+      </w:pPr>
+      <w:rPr>
+        <w:rFonts w:hint="default" w:ascii="Symbol" w:hAnsi="Symbol"/>
+      </w:rPr>
+    </w:lvl>
+    <w:lvl xmlns:w="http://schemas.openxmlformats.org/wordprocessingml/2006/main" w:ilvl="7">
+      <w:start w:val="1"/>
+      <w:numFmt w:val="bullet"/>
+      <w:lvlText w:val="o"/>
+      <w:lvlJc w:val="left"/>
+      <w:pPr>
+        <w:ind w:left="5760" w:hanging="360"/>
+      </w:pPr>
+      <w:rPr>
+        <w:rFonts w:hint="default" w:ascii="Courier New" w:hAnsi="Courier New"/>
+      </w:rPr>
+    </w:lvl>
+    <w:lvl xmlns:w="http://schemas.openxmlformats.org/wordprocessingml/2006/main" w:ilvl="8">
+      <w:start w:val="1"/>
+      <w:numFmt w:val="bullet"/>
+      <w:lvlText w:val=""/>
+      <w:lvlJc w:val="left"/>
+      <w:pPr>
+        <w:ind w:left="6480" w:hanging="360"/>
+      </w:pPr>
+      <w:rPr>
+        <w:rFonts w:hint="default" w:ascii="Wingdings" w:hAnsi="Wingdings"/>
+      </w:rPr>
+    </w:lvl>
+  </w:abstractNum>
+  <w:abstractNum xmlns:w="http://schemas.openxmlformats.org/wordprocessingml/2006/main" w:abstractNumId="17">
+    <w:nsid w:val="5bc57c18"/>
+    <w:multiLevelType xmlns:w="http://schemas.openxmlformats.org/wordprocessingml/2006/main" w:val="hybridMultilevel"/>
+    <w:lvl xmlns:w="http://schemas.openxmlformats.org/wordprocessingml/2006/main" w:ilvl="0">
+      <w:start w:val="1"/>
+      <w:numFmt w:val="bullet"/>
+      <w:lvlText w:val="-"/>
+      <w:lvlJc w:val="left"/>
+      <w:pPr>
+        <w:ind w:left="720" w:hanging="360"/>
+      </w:pPr>
+      <w:rPr>
+        <w:rFonts w:hint="default" w:ascii="SimSun" w:hAnsi="SimSun"/>
+      </w:rPr>
+    </w:lvl>
+    <w:lvl xmlns:w="http://schemas.openxmlformats.org/wordprocessingml/2006/main" w:ilvl="1">
+      <w:start w:val="1"/>
+      <w:numFmt w:val="bullet"/>
+      <w:lvlText w:val="o"/>
+      <w:lvlJc w:val="left"/>
+      <w:pPr>
+        <w:ind w:left="1440" w:hanging="360"/>
+      </w:pPr>
+      <w:rPr>
+        <w:rFonts w:hint="default" w:ascii="Courier New" w:hAnsi="Courier New"/>
+      </w:rPr>
+    </w:lvl>
+    <w:lvl xmlns:w="http://schemas.openxmlformats.org/wordprocessingml/2006/main" w:ilvl="2">
+      <w:start w:val="1"/>
+      <w:numFmt w:val="bullet"/>
+      <w:lvlText w:val=""/>
+      <w:lvlJc w:val="left"/>
+      <w:pPr>
+        <w:ind w:left="2160" w:hanging="360"/>
+      </w:pPr>
+      <w:rPr>
+        <w:rFonts w:hint="default" w:ascii="Wingdings" w:hAnsi="Wingdings"/>
+      </w:rPr>
+    </w:lvl>
+    <w:lvl xmlns:w="http://schemas.openxmlformats.org/wordprocessingml/2006/main" w:ilvl="3">
+      <w:start w:val="1"/>
+      <w:numFmt w:val="bullet"/>
+      <w:lvlText w:val=""/>
+      <w:lvlJc w:val="left"/>
+      <w:pPr>
+        <w:ind w:left="2880" w:hanging="360"/>
+      </w:pPr>
+      <w:rPr>
+        <w:rFonts w:hint="default" w:ascii="Symbol" w:hAnsi="Symbol"/>
+      </w:rPr>
+    </w:lvl>
+    <w:lvl xmlns:w="http://schemas.openxmlformats.org/wordprocessingml/2006/main" w:ilvl="4">
+      <w:start w:val="1"/>
+      <w:numFmt w:val="bullet"/>
+      <w:lvlText w:val="o"/>
+      <w:lvlJc w:val="left"/>
+      <w:pPr>
+        <w:ind w:left="3600" w:hanging="360"/>
+      </w:pPr>
+      <w:rPr>
+        <w:rFonts w:hint="default" w:ascii="Courier New" w:hAnsi="Courier New"/>
+      </w:rPr>
+    </w:lvl>
+    <w:lvl xmlns:w="http://schemas.openxmlformats.org/wordprocessingml/2006/main" w:ilvl="5">
+      <w:start w:val="1"/>
+      <w:numFmt w:val="bullet"/>
+      <w:lvlText w:val=""/>
+      <w:lvlJc w:val="left"/>
+      <w:pPr>
+        <w:ind w:left="4320" w:hanging="360"/>
+      </w:pPr>
+      <w:rPr>
+        <w:rFonts w:hint="default" w:ascii="Wingdings" w:hAnsi="Wingdings"/>
+      </w:rPr>
+    </w:lvl>
+    <w:lvl xmlns:w="http://schemas.openxmlformats.org/wordprocessingml/2006/main" w:ilvl="6">
+      <w:start w:val="1"/>
+      <w:numFmt w:val="bullet"/>
+      <w:lvlText w:val=""/>
+      <w:lvlJc w:val="left"/>
+      <w:pPr>
+        <w:ind w:left="5040" w:hanging="360"/>
+      </w:pPr>
+      <w:rPr>
+        <w:rFonts w:hint="default" w:ascii="Symbol" w:hAnsi="Symbol"/>
+      </w:rPr>
+    </w:lvl>
+    <w:lvl xmlns:w="http://schemas.openxmlformats.org/wordprocessingml/2006/main" w:ilvl="7">
+      <w:start w:val="1"/>
+      <w:numFmt w:val="bullet"/>
+      <w:lvlText w:val="o"/>
+      <w:lvlJc w:val="left"/>
+      <w:pPr>
+        <w:ind w:left="5760" w:hanging="360"/>
+      </w:pPr>
+      <w:rPr>
+        <w:rFonts w:hint="default" w:ascii="Courier New" w:hAnsi="Courier New"/>
+      </w:rPr>
+    </w:lvl>
+    <w:lvl xmlns:w="http://schemas.openxmlformats.org/wordprocessingml/2006/main" w:ilvl="8">
+      <w:start w:val="1"/>
+      <w:numFmt w:val="bullet"/>
+      <w:lvlText w:val=""/>
+      <w:lvlJc w:val="left"/>
+      <w:pPr>
+        <w:ind w:left="6480" w:hanging="360"/>
+      </w:pPr>
+      <w:rPr>
+        <w:rFonts w:hint="default" w:ascii="Wingdings" w:hAnsi="Wingdings"/>
+      </w:rPr>
+    </w:lvl>
+  </w:abstractNum>
+  <w:abstractNum xmlns:w="http://schemas.openxmlformats.org/wordprocessingml/2006/main" w:abstractNumId="16">
+    <w:nsid w:val="4ea026f4"/>
+    <w:multiLevelType xmlns:w="http://schemas.openxmlformats.org/wordprocessingml/2006/main" w:val="hybridMultilevel"/>
+    <w:lvl xmlns:w="http://schemas.openxmlformats.org/wordprocessingml/2006/main" w:ilvl="0">
+      <w:start w:val="1"/>
+      <w:numFmt w:val="decimal"/>
+      <w:lvlText w:val="%1."/>
+      <w:lvlJc w:val="left"/>
+      <w:pPr>
+        <w:ind w:left="720" w:hanging="360"/>
+      </w:pPr>
+    </w:lvl>
+    <w:lvl xmlns:w="http://schemas.openxmlformats.org/wordprocessingml/2006/main" w:ilvl="1">
+      <w:start w:val="1"/>
+      <w:numFmt w:val="lowerLetter"/>
+      <w:lvlText w:val="%2."/>
+      <w:lvlJc w:val="left"/>
+      <w:pPr>
+        <w:ind w:left="1440" w:hanging="360"/>
+      </w:pPr>
+    </w:lvl>
+    <w:lvl xmlns:w="http://schemas.openxmlformats.org/wordprocessingml/2006/main" w:ilvl="2">
+      <w:start w:val="1"/>
+      <w:numFmt w:val="lowerRoman"/>
+      <w:lvlText w:val="%3."/>
+      <w:lvlJc w:val="right"/>
+      <w:pPr>
+        <w:ind w:left="2160" w:hanging="180"/>
+      </w:pPr>
+    </w:lvl>
+    <w:lvl xmlns:w="http://schemas.openxmlformats.org/wordprocessingml/2006/main" w:ilvl="3">
+      <w:start w:val="1"/>
+      <w:numFmt w:val="decimal"/>
+      <w:lvlText w:val="%4."/>
+      <w:lvlJc w:val="left"/>
+      <w:pPr>
+        <w:ind w:left="2880" w:hanging="360"/>
+      </w:pPr>
+    </w:lvl>
+    <w:lvl xmlns:w="http://schemas.openxmlformats.org/wordprocessingml/2006/main" w:ilvl="4">
+      <w:start w:val="1"/>
+      <w:numFmt w:val="lowerLetter"/>
+      <w:lvlText w:val="%5."/>
+      <w:lvlJc w:val="left"/>
+      <w:pPr>
+        <w:ind w:left="3600" w:hanging="360"/>
+      </w:pPr>
+    </w:lvl>
+    <w:lvl xmlns:w="http://schemas.openxmlformats.org/wordprocessingml/2006/main" w:ilvl="5">
+      <w:start w:val="1"/>
+      <w:numFmt w:val="lowerRoman"/>
+      <w:lvlText w:val="%6."/>
+      <w:lvlJc w:val="right"/>
+      <w:pPr>
+        <w:ind w:left="4320" w:hanging="180"/>
+      </w:pPr>
+    </w:lvl>
+    <w:lvl xmlns:w="http://schemas.openxmlformats.org/wordprocessingml/2006/main" w:ilvl="6">
+      <w:start w:val="1"/>
+      <w:numFmt w:val="decimal"/>
+      <w:lvlText w:val="%7."/>
+      <w:lvlJc w:val="left"/>
+      <w:pPr>
+        <w:ind w:left="5040" w:hanging="360"/>
+      </w:pPr>
+    </w:lvl>
+    <w:lvl xmlns:w="http://schemas.openxmlformats.org/wordprocessingml/2006/main" w:ilvl="7">
+      <w:start w:val="1"/>
+      <w:numFmt w:val="lowerLetter"/>
+      <w:lvlText w:val="%8."/>
+      <w:lvlJc w:val="left"/>
+      <w:pPr>
+        <w:ind w:left="5760" w:hanging="360"/>
+      </w:pPr>
+    </w:lvl>
+    <w:lvl xmlns:w="http://schemas.openxmlformats.org/wordprocessingml/2006/main" w:ilvl="8">
+      <w:start w:val="1"/>
+      <w:numFmt w:val="lowerRoman"/>
+      <w:lvlText w:val="%9."/>
+      <w:lvlJc w:val="right"/>
+      <w:pPr>
+        <w:ind w:left="6480" w:hanging="180"/>
+      </w:pPr>
+    </w:lvl>
+  </w:abstractNum>
+  <w:abstractNum xmlns:w="http://schemas.openxmlformats.org/wordprocessingml/2006/main" w:abstractNumId="15">
+    <w:nsid w:val="5e855793"/>
+    <w:multiLevelType xmlns:w="http://schemas.openxmlformats.org/wordprocessingml/2006/main" w:val="hybridMultilevel"/>
+    <w:lvl xmlns:w="http://schemas.openxmlformats.org/wordprocessingml/2006/main" w:ilvl="0">
+      <w:start w:val="1"/>
+      <w:numFmt w:val="decimal"/>
+      <w:lvlText w:val="%1."/>
+      <w:lvlJc w:val="left"/>
+      <w:pPr>
+        <w:ind w:left="720" w:hanging="360"/>
+      </w:pPr>
+    </w:lvl>
+    <w:lvl xmlns:w="http://schemas.openxmlformats.org/wordprocessingml/2006/main" w:ilvl="1">
+      <w:start w:val="1"/>
+      <w:numFmt w:val="lowerLetter"/>
+      <w:lvlText w:val="%2."/>
+      <w:lvlJc w:val="left"/>
+      <w:pPr>
+        <w:ind w:left="1440" w:hanging="360"/>
+      </w:pPr>
+    </w:lvl>
+    <w:lvl xmlns:w="http://schemas.openxmlformats.org/wordprocessingml/2006/main" w:ilvl="2">
+      <w:start w:val="1"/>
+      <w:numFmt w:val="lowerRoman"/>
+      <w:lvlText w:val="%3."/>
+      <w:lvlJc w:val="right"/>
+      <w:pPr>
+        <w:ind w:left="2160" w:hanging="180"/>
+      </w:pPr>
+    </w:lvl>
+    <w:lvl xmlns:w="http://schemas.openxmlformats.org/wordprocessingml/2006/main" w:ilvl="3">
+      <w:start w:val="1"/>
+      <w:numFmt w:val="decimal"/>
+      <w:lvlText w:val="%4."/>
+      <w:lvlJc w:val="left"/>
+      <w:pPr>
+        <w:ind w:left="2880" w:hanging="360"/>
+      </w:pPr>
+    </w:lvl>
+    <w:lvl xmlns:w="http://schemas.openxmlformats.org/wordprocessingml/2006/main" w:ilvl="4">
+      <w:start w:val="1"/>
+      <w:numFmt w:val="lowerLetter"/>
+      <w:lvlText w:val="%5."/>
+      <w:lvlJc w:val="left"/>
+      <w:pPr>
+        <w:ind w:left="3600" w:hanging="360"/>
+      </w:pPr>
+    </w:lvl>
+    <w:lvl xmlns:w="http://schemas.openxmlformats.org/wordprocessingml/2006/main" w:ilvl="5">
+      <w:start w:val="1"/>
+      <w:numFmt w:val="lowerRoman"/>
+      <w:lvlText w:val="%6."/>
+      <w:lvlJc w:val="right"/>
+      <w:pPr>
+        <w:ind w:left="4320" w:hanging="180"/>
+      </w:pPr>
+    </w:lvl>
+    <w:lvl xmlns:w="http://schemas.openxmlformats.org/wordprocessingml/2006/main" w:ilvl="6">
+      <w:start w:val="1"/>
+      <w:numFmt w:val="decimal"/>
+      <w:lvlText w:val="%7."/>
+      <w:lvlJc w:val="left"/>
+      <w:pPr>
+        <w:ind w:left="5040" w:hanging="360"/>
+      </w:pPr>
+    </w:lvl>
+    <w:lvl xmlns:w="http://schemas.openxmlformats.org/wordprocessingml/2006/main" w:ilvl="7">
+      <w:start w:val="1"/>
+      <w:numFmt w:val="lowerLetter"/>
+      <w:lvlText w:val="%8."/>
+      <w:lvlJc w:val="left"/>
+      <w:pPr>
+        <w:ind w:left="5760" w:hanging="360"/>
+      </w:pPr>
+    </w:lvl>
+    <w:lvl xmlns:w="http://schemas.openxmlformats.org/wordprocessingml/2006/main" w:ilvl="8">
+      <w:start w:val="1"/>
+      <w:numFmt w:val="lowerRoman"/>
+      <w:lvlText w:val="%9."/>
+      <w:lvlJc w:val="right"/>
+      <w:pPr>
+        <w:ind w:left="6480" w:hanging="180"/>
+      </w:pPr>
+    </w:lvl>
+  </w:abstractNum>
   <w:abstractNum w:abstractNumId="0" w15:restartNumberingAfterBreak="0">
     <w:nsid w:val="0691280B"/>
     <w:multiLevelType w:val="hybridMultilevel"/>
@@ -10100,6 +10560,21 @@
       </w:rPr>
     </w:lvl>
   </w:abstractNum>
+  <w:num w:numId="20">
+    <w:abstractNumId w:val="19"/>
+  </w:num>
+  <w:num w:numId="19">
+    <w:abstractNumId w:val="18"/>
+  </w:num>
+  <w:num w:numId="18">
+    <w:abstractNumId w:val="17"/>
+  </w:num>
+  <w:num w:numId="17">
+    <w:abstractNumId w:val="16"/>
+  </w:num>
+  <w:num w:numId="16">
+    <w:abstractNumId w:val="15"/>
+  </w:num>
   <w:num w:numId="1" w16cid:durableId="1024936281">
     <w:abstractNumId w:val="4"/>
   </w:num>
@@ -10146,6 +10621,10 @@
     <w:abstractNumId w:val="3"/>
   </w:num>
 </w:numbering>
+</file>
+
+<file path=word/people.xml><?xml version="1.0" encoding="utf-8"?>
+<w15:people xmlns:mc="http://schemas.openxmlformats.org/markup-compatibility/2006" xmlns:w15="http://schemas.microsoft.com/office/word/2012/wordml" mc:Ignorable="w15"/>
 </file>
 
 <file path=word/styles.xml><?xml version="1.0" encoding="utf-8"?>

</xml_diff>